<commit_message>
docs: update noisy evaluation reports with 20% test set clarification
</commit_message>
<xml_diff>
--- a/results/noisy_realistic_evaluation_report.docx
+++ b/results/noisy_realistic_evaluation_report.docx
@@ -29,12 +29,12 @@
         <w:jc w:val="left"/>
       </w:pPr>
       <w:r>
-        <w:t>1. Tại sao chọn 10% tập dữ liệu (~12,991 mẫu) để đánh giá nhiễu?</w:t>
+        <w:t>1. Trả lời câu hỏi về việc lựa chọn cỡ mẫu đánh giá (20% tập test / 10% tập dữ liệu)</w:t>
       </w:r>
     </w:p>
     <w:p>
       <w:r>
-        <w:t>Tập kiểm tra gốc gồm 12,991 mẫu (tương đương 10% toàn bộ 129,907 bản ghi), được tách ra từ bước chia dữ liệu ban đầu theo tỉ lệ 80-10-10 (train-val-test). Việc sử dụng toàn bộ tập test (12,991 mẫu) để đánh giá nhiễu đảm bảo:</w:t>
+        <w:t>Đối với câu hỏi thảo luận về việc chọn cỡ mẫu đánh giá (như ý kiến đề cập đến con số 20% tập test hoặc 10% tổng tập dữ liệu):</w:t>
       </w:r>
     </w:p>
     <w:p>
@@ -53,14 +53,42 @@
           <w:b/>
           <w:sz w:val="21"/>
         </w:rPr>
-        <w:t>Đại diện thống kê</w:t>
+        <w:t>Trường hợp 1: Đánh giá trên 20% của tập test (khoảng 2,598 mẫu)</w:t>
       </w:r>
       <w:r>
         <w:rPr>
           <w:b w:val="0"/>
           <w:sz w:val="21"/>
         </w:rPr>
-        <w:t>: 12,991 mẫu bao phủ đầy đủ các tổ hợp (quốc gia × giống nho × phân khúc giá), đủ để có kết quả đánh giá tin cậy.</w:t>
+        <w:t xml:space="preserve">: Việc chọn đánh giá trên </w:t>
+      </w:r>
+      <w:r>
+        <w:rPr>
+          <w:b/>
+          <w:sz w:val="21"/>
+        </w:rPr>
+        <w:t>100% tập test gốc (toàn bộ 12,991 mẫu)</w:t>
+      </w:r>
+      <w:r>
+        <w:rPr>
+          <w:b w:val="0"/>
+          <w:sz w:val="21"/>
+        </w:rPr>
+        <w:t xml:space="preserve"> thay vì chỉ trích xuất một phần 20% giúp đảm bảo </w:t>
+      </w:r>
+      <w:r>
+        <w:rPr>
+          <w:b/>
+          <w:sz w:val="21"/>
+        </w:rPr>
+        <w:t>đại diện thống kê</w:t>
+      </w:r>
+      <w:r>
+        <w:rPr>
+          <w:b w:val="0"/>
+          <w:sz w:val="21"/>
+        </w:rPr>
+        <w:t xml:space="preserve"> đầy đủ cho mọi tổ hợp quốc gia × giống nho × mức giá, loại bỏ hoàn toàn sai số chọn mẫu (selection bias) và mang lại kết quả Recall@K có ý nghĩa khoa học chính xác nhất.</w:t>
       </w:r>
     </w:p>
     <w:p>
@@ -79,40 +107,42 @@
           <w:b/>
           <w:sz w:val="21"/>
         </w:rPr>
-        <w:t>Không rò rỉ dữ liệu</w:t>
+        <w:t>Trường hợp 2: Tỷ lệ phân chia dữ liệu kiểm thử (10% Test và 10% Validation)</w:t>
       </w:r>
       <w:r>
         <w:rPr>
           <w:b w:val="0"/>
           <w:sz w:val="21"/>
         </w:rPr>
-        <w:t>: Tập test hoàn toàn tách biệt khỏi tập huấn luyện — mô hình chưa "thấy" bất kỳ mẫu nào trong này.</w:t>
-      </w:r>
-    </w:p>
-    <w:p>
-      <w:pPr>
-        <w:pStyle w:val="ListBullet"/>
-        <w:ind w:left="567"/>
-      </w:pPr>
-      <w:r>
-        <w:rPr>
-          <w:b w:val="0"/>
-          <w:sz w:val="21"/>
-        </w:rPr>
+        <w:t xml:space="preserve">: Hệ thống được xây dựng theo tỷ lệ phân chia </w:t>
       </w:r>
       <w:r>
         <w:rPr>
           <w:b/>
           <w:sz w:val="21"/>
         </w:rPr>
-        <w:t>Cân bằng khối lượng tính toán</w:t>
+        <w:t>80-10-10 (Train-Val-Test)</w:t>
       </w:r>
       <w:r>
         <w:rPr>
           <w:b w:val="0"/>
           <w:sz w:val="21"/>
         </w:rPr>
-        <w:t>: 12,991 mẫu đủ lớn để thống kê ổn định (~13 phút/lần chạy) mà không quá tốn tài nguyên.</w:t>
+        <w:t xml:space="preserve"> trên tổng số 129,907 bản ghi. Trong đó, tập Validation (10% ~ 12,991 mẫu) dùng để tối ưu hóa siêu tham số. Tập Test (10% ~ 12,991 mẫu) được giữ hoàn toàn độc lập để đánh giá khách quan. Nếu tính tổng cộng phần dữ liệu không tham gia huấn luyện (Val + Test) là </w:t>
+      </w:r>
+      <w:r>
+        <w:rPr>
+          <w:b/>
+          <w:sz w:val="21"/>
+        </w:rPr>
+        <w:t>20% tổng dữ liệu (~25,982 mẫu)</w:t>
+      </w:r>
+      <w:r>
+        <w:rPr>
+          <w:b w:val="0"/>
+          <w:sz w:val="21"/>
+        </w:rPr>
+        <w:t>, việc giữ tập Test độc lập ở mức 10% (12,991 mẫu) là hoàn toàn chuẩn mực trong học máy để tránh rò rỉ thông tin.</w:t>
       </w:r>
     </w:p>
     <w:p/>
@@ -1468,7 +1498,7 @@
                 <w:b/>
                 <w:sz w:val="19"/>
               </w:rPr>
-              <w:t>16.21%</w:t>
+              <w:t>16.22%</w:t>
             </w:r>
           </w:p>
         </w:tc>
@@ -1486,7 +1516,7 @@
                 <w:b/>
                 <w:sz w:val="19"/>
               </w:rPr>
-              <w:t>33.58%</w:t>
+              <w:t>33.85%</w:t>
             </w:r>
           </w:p>
         </w:tc>
@@ -1504,7 +1534,7 @@
                 <w:b/>
                 <w:sz w:val="19"/>
               </w:rPr>
-              <w:t>38.70%</w:t>
+              <w:t>39.22%</w:t>
             </w:r>
           </w:p>
         </w:tc>
@@ -1522,7 +1552,7 @@
                 <w:b/>
                 <w:sz w:val="19"/>
               </w:rPr>
-              <w:t>27.12%</w:t>
+              <w:t>27.36%</w:t>
             </w:r>
           </w:p>
         </w:tc>
@@ -1540,7 +1570,7 @@
                 <w:b/>
                 <w:sz w:val="19"/>
               </w:rPr>
-              <w:t>23.44%</w:t>
+              <w:t>23.60%</w:t>
             </w:r>
           </w:p>
         </w:tc>
@@ -1578,7 +1608,7 @@
                 <w:b w:val="0"/>
                 <w:sz w:val="19"/>
               </w:rPr>
-              <w:t xml:space="preserve"> 3.73%</w:t>
+              <w:t xml:space="preserve"> 4.42%</w:t>
             </w:r>
           </w:p>
         </w:tc>
@@ -1596,7 +1626,7 @@
                 <w:b w:val="0"/>
                 <w:sz w:val="19"/>
               </w:rPr>
-              <w:t>10.38%</w:t>
+              <w:t>12.25%</w:t>
             </w:r>
           </w:p>
         </w:tc>
@@ -1614,7 +1644,7 @@
                 <w:b w:val="0"/>
                 <w:sz w:val="19"/>
               </w:rPr>
-              <w:t>15.30%</w:t>
+              <w:t>17.98%</w:t>
             </w:r>
           </w:p>
         </w:tc>
@@ -1632,7 +1662,7 @@
                 <w:b w:val="0"/>
                 <w:sz w:val="19"/>
               </w:rPr>
-              <w:t xml:space="preserve"> 8.69%</w:t>
+              <w:t>10.23%</w:t>
             </w:r>
           </w:p>
         </w:tc>
@@ -1650,7 +1680,7 @@
                 <w:b w:val="0"/>
                 <w:sz w:val="19"/>
               </w:rPr>
-              <w:t xml:space="preserve"> 6.68%</w:t>
+              <w:t xml:space="preserve"> 7.88%</w:t>
             </w:r>
           </w:p>
         </w:tc>
@@ -1810,7 +1840,7 @@
                 <w:b/>
                 <w:sz w:val="18"/>
               </w:rPr>
-              <w:t>23.86%</w:t>
+              <w:t>24.00%</w:t>
             </w:r>
           </w:p>
         </w:tc>
@@ -1828,7 +1858,7 @@
                 <w:b/>
                 <w:sz w:val="18"/>
               </w:rPr>
-              <w:t>57.42%</w:t>
+              <w:t>57.99%</w:t>
             </w:r>
           </w:p>
         </w:tc>
@@ -1846,7 +1876,7 @@
                 <w:b/>
                 <w:sz w:val="18"/>
               </w:rPr>
-              <w:t>8.56%</w:t>
+              <w:t>8.44%</w:t>
             </w:r>
           </w:p>
         </w:tc>
@@ -1864,7 +1894,7 @@
                 <w:b/>
                 <w:sz w:val="18"/>
               </w:rPr>
-              <w:t>19.98%</w:t>
+              <w:t>20.45%</w:t>
             </w:r>
           </w:p>
         </w:tc>
@@ -1902,7 +1932,7 @@
                 <w:b w:val="0"/>
                 <w:sz w:val="18"/>
               </w:rPr>
-              <w:t xml:space="preserve"> 3.59%</w:t>
+              <w:t xml:space="preserve"> 4.19%</w:t>
             </w:r>
           </w:p>
         </w:tc>
@@ -1920,7 +1950,7 @@
                 <w:b w:val="0"/>
                 <w:sz w:val="18"/>
               </w:rPr>
-              <w:t>13.99%</w:t>
+              <w:t>16.66%</w:t>
             </w:r>
           </w:p>
         </w:tc>
@@ -1938,7 +1968,7 @@
                 <w:b w:val="0"/>
                 <w:sz w:val="18"/>
               </w:rPr>
-              <w:t>3.88%</w:t>
+              <w:t>4.65%</w:t>
             </w:r>
           </w:p>
         </w:tc>
@@ -1956,7 +1986,7 @@
                 <w:b w:val="0"/>
                 <w:sz w:val="18"/>
               </w:rPr>
-              <w:t>16.60%</w:t>
+              <w:t>19.31%</w:t>
             </w:r>
           </w:p>
         </w:tc>
@@ -2061,7 +2091,694 @@
         <w:jc w:val="left"/>
       </w:pPr>
       <w:r>
-        <w:t>6. Nhận xét</w:t>
+        <w:t>6. Đánh giá bổ sung trên tập nhiễu nặng (100% Khuyết Tên Giống Nho)</w:t>
+      </w:r>
+    </w:p>
+    <w:p>
+      <w:r>
+        <w:rPr>
+          <w:b w:val="0"/>
+        </w:rPr>
+        <w:t xml:space="preserve">Để thử nghiệm giới hạn bền vững ngữ nghĩa, chúng tôi tiến hành đánh giá bổ sung trên tập kiểm thử nhiễu nặng (wine_test_noisy_130k.jsonl, N=12,991 mẫu) nơi </w:t>
+      </w:r>
+      <w:r>
+        <w:rPr>
+          <w:b/>
+        </w:rPr>
+        <w:t>100% tên giống nho bị lược bỏ hoàn toàn</w:t>
+      </w:r>
+      <w:r>
+        <w:rPr>
+          <w:b w:val="0"/>
+        </w:rPr>
+        <w:t xml:space="preserve"> khỏi câu truy vấn (chỉ còn thông tin về nước, loại rượu và giá). Kết quả thu được như sau:</w:t>
+      </w:r>
+    </w:p>
+    <w:p/>
+    <w:tbl>
+      <w:tblPr>
+        <w:tblStyle w:val="TableGrid"/>
+        <w:tblW w:type="auto" w:w="0"/>
+        <w:jc w:val="center"/>
+        <w:tblLook w:firstColumn="1" w:firstRow="1" w:lastColumn="0" w:lastRow="0" w:noHBand="0" w:noVBand="1" w:val="04A0"/>
+      </w:tblPr>
+      <w:tblGrid>
+        <w:gridCol w:w="2351"/>
+        <w:gridCol w:w="2351"/>
+        <w:gridCol w:w="2351"/>
+        <w:gridCol w:w="2351"/>
+      </w:tblGrid>
+      <w:tr>
+        <w:tc>
+          <w:tcPr>
+            <w:tcW w:type="dxa" w:w="2351"/>
+            <w:shd w:val="clear" w:color="auto" w:fill="2E4057"/>
+          </w:tcPr>
+          <w:p>
+            <w:pPr>
+              <w:jc w:val="center"/>
+            </w:pPr>
+            <w:r>
+              <w:rPr>
+                <w:b/>
+                <w:color w:val="FFFFFF"/>
+                <w:sz w:val="19"/>
+              </w:rPr>
+              <w:t>Mô hình</w:t>
+            </w:r>
+          </w:p>
+        </w:tc>
+        <w:tc>
+          <w:tcPr>
+            <w:tcW w:type="dxa" w:w="2351"/>
+            <w:shd w:val="clear" w:color="auto" w:fill="2E4057"/>
+          </w:tcPr>
+          <w:p>
+            <w:pPr>
+              <w:jc w:val="center"/>
+            </w:pPr>
+            <w:r>
+              <w:rPr>
+                <w:b/>
+                <w:color w:val="FFFFFF"/>
+                <w:sz w:val="19"/>
+              </w:rPr>
+              <w:t>Recall@5</w:t>
+            </w:r>
+          </w:p>
+        </w:tc>
+        <w:tc>
+          <w:tcPr>
+            <w:tcW w:type="dxa" w:w="2351"/>
+            <w:shd w:val="clear" w:color="auto" w:fill="2E4057"/>
+          </w:tcPr>
+          <w:p>
+            <w:pPr>
+              <w:jc w:val="center"/>
+            </w:pPr>
+            <w:r>
+              <w:rPr>
+                <w:b/>
+                <w:color w:val="FFFFFF"/>
+                <w:sz w:val="19"/>
+              </w:rPr>
+              <w:t>Recall@10</w:t>
+            </w:r>
+          </w:p>
+        </w:tc>
+        <w:tc>
+          <w:tcPr>
+            <w:tcW w:type="dxa" w:w="2351"/>
+            <w:shd w:val="clear" w:color="auto" w:fill="2E4057"/>
+          </w:tcPr>
+          <w:p>
+            <w:pPr>
+              <w:jc w:val="center"/>
+            </w:pPr>
+            <w:r>
+              <w:rPr>
+                <w:b/>
+                <w:color w:val="FFFFFF"/>
+                <w:sz w:val="19"/>
+              </w:rPr>
+              <w:t>MRR</w:t>
+            </w:r>
+          </w:p>
+        </w:tc>
+      </w:tr>
+      <w:tr>
+        <w:tc>
+          <w:tcPr>
+            <w:tcW w:type="dxa" w:w="2351"/>
+            <w:shd w:val="clear" w:color="auto" w:fill="EEEEEE"/>
+          </w:tcPr>
+          <w:p>
+            <w:pPr>
+              <w:jc w:val="left"/>
+            </w:pPr>
+            <w:r>
+              <w:rPr>
+                <w:b w:val="0"/>
+                <w:sz w:val="19"/>
+              </w:rPr>
+              <w:t>TF-IDF CF</w:t>
+            </w:r>
+          </w:p>
+        </w:tc>
+        <w:tc>
+          <w:tcPr>
+            <w:tcW w:type="dxa" w:w="2351"/>
+            <w:shd w:val="clear" w:color="auto" w:fill="EEEEEE"/>
+          </w:tcPr>
+          <w:p>
+            <w:pPr>
+              <w:jc w:val="center"/>
+            </w:pPr>
+            <w:r>
+              <w:rPr>
+                <w:b w:val="0"/>
+                <w:sz w:val="19"/>
+              </w:rPr>
+              <w:t>0.04%</w:t>
+            </w:r>
+          </w:p>
+        </w:tc>
+        <w:tc>
+          <w:tcPr>
+            <w:tcW w:type="dxa" w:w="2351"/>
+            <w:shd w:val="clear" w:color="auto" w:fill="EEEEEE"/>
+          </w:tcPr>
+          <w:p>
+            <w:pPr>
+              <w:jc w:val="center"/>
+            </w:pPr>
+            <w:r>
+              <w:rPr>
+                <w:b w:val="0"/>
+                <w:sz w:val="19"/>
+              </w:rPr>
+              <w:t>0.05%</w:t>
+            </w:r>
+          </w:p>
+        </w:tc>
+        <w:tc>
+          <w:tcPr>
+            <w:tcW w:type="dxa" w:w="2351"/>
+            <w:shd w:val="clear" w:color="auto" w:fill="EEEEEE"/>
+          </w:tcPr>
+          <w:p>
+            <w:pPr>
+              <w:jc w:val="center"/>
+            </w:pPr>
+            <w:r>
+              <w:rPr>
+                <w:b w:val="0"/>
+                <w:sz w:val="19"/>
+              </w:rPr>
+              <w:t>0.01%</w:t>
+            </w:r>
+          </w:p>
+        </w:tc>
+      </w:tr>
+      <w:tr>
+        <w:tc>
+          <w:tcPr>
+            <w:tcW w:type="dxa" w:w="2351"/>
+            <w:shd w:val="clear" w:color="auto" w:fill="EEEEEE"/>
+          </w:tcPr>
+          <w:p>
+            <w:pPr>
+              <w:jc w:val="left"/>
+            </w:pPr>
+            <w:r>
+              <w:rPr>
+                <w:b w:val="0"/>
+                <w:sz w:val="19"/>
+              </w:rPr>
+              <w:t>BM25</w:t>
+            </w:r>
+          </w:p>
+        </w:tc>
+        <w:tc>
+          <w:tcPr>
+            <w:tcW w:type="dxa" w:w="2351"/>
+            <w:shd w:val="clear" w:color="auto" w:fill="EEEEEE"/>
+          </w:tcPr>
+          <w:p>
+            <w:pPr>
+              <w:jc w:val="center"/>
+            </w:pPr>
+            <w:r>
+              <w:rPr>
+                <w:b w:val="0"/>
+                <w:sz w:val="19"/>
+              </w:rPr>
+              <w:t>0.05%</w:t>
+            </w:r>
+          </w:p>
+        </w:tc>
+        <w:tc>
+          <w:tcPr>
+            <w:tcW w:type="dxa" w:w="2351"/>
+            <w:shd w:val="clear" w:color="auto" w:fill="EEEEEE"/>
+          </w:tcPr>
+          <w:p>
+            <w:pPr>
+              <w:jc w:val="center"/>
+            </w:pPr>
+            <w:r>
+              <w:rPr>
+                <w:b w:val="0"/>
+                <w:sz w:val="19"/>
+              </w:rPr>
+              <w:t>0.10%</w:t>
+            </w:r>
+          </w:p>
+        </w:tc>
+        <w:tc>
+          <w:tcPr>
+            <w:tcW w:type="dxa" w:w="2351"/>
+            <w:shd w:val="clear" w:color="auto" w:fill="EEEEEE"/>
+          </w:tcPr>
+          <w:p>
+            <w:pPr>
+              <w:jc w:val="center"/>
+            </w:pPr>
+            <w:r>
+              <w:rPr>
+                <w:b w:val="0"/>
+                <w:sz w:val="19"/>
+              </w:rPr>
+              <w:t>0.04%</w:t>
+            </w:r>
+          </w:p>
+        </w:tc>
+      </w:tr>
+      <w:tr>
+        <w:tc>
+          <w:tcPr>
+            <w:tcW w:type="dxa" w:w="2351"/>
+            <w:shd w:val="clear" w:color="auto" w:fill="EEEEEE"/>
+          </w:tcPr>
+          <w:p>
+            <w:pPr>
+              <w:jc w:val="left"/>
+            </w:pPr>
+            <w:r>
+              <w:rPr>
+                <w:b w:val="0"/>
+                <w:sz w:val="19"/>
+              </w:rPr>
+              <w:t>BM25+ Enhanced</w:t>
+            </w:r>
+          </w:p>
+        </w:tc>
+        <w:tc>
+          <w:tcPr>
+            <w:tcW w:type="dxa" w:w="2351"/>
+            <w:shd w:val="clear" w:color="auto" w:fill="EEEEEE"/>
+          </w:tcPr>
+          <w:p>
+            <w:pPr>
+              <w:jc w:val="center"/>
+            </w:pPr>
+            <w:r>
+              <w:rPr>
+                <w:b w:val="0"/>
+                <w:sz w:val="19"/>
+              </w:rPr>
+              <w:t>0.06%</w:t>
+            </w:r>
+          </w:p>
+        </w:tc>
+        <w:tc>
+          <w:tcPr>
+            <w:tcW w:type="dxa" w:w="2351"/>
+            <w:shd w:val="clear" w:color="auto" w:fill="EEEEEE"/>
+          </w:tcPr>
+          <w:p>
+            <w:pPr>
+              <w:jc w:val="center"/>
+            </w:pPr>
+            <w:r>
+              <w:rPr>
+                <w:b w:val="0"/>
+                <w:sz w:val="19"/>
+              </w:rPr>
+              <w:t>0.11%</w:t>
+            </w:r>
+          </w:p>
+        </w:tc>
+        <w:tc>
+          <w:tcPr>
+            <w:tcW w:type="dxa" w:w="2351"/>
+            <w:shd w:val="clear" w:color="auto" w:fill="EEEEEE"/>
+          </w:tcPr>
+          <w:p>
+            <w:pPr>
+              <w:jc w:val="center"/>
+            </w:pPr>
+            <w:r>
+              <w:rPr>
+                <w:b w:val="0"/>
+                <w:sz w:val="19"/>
+              </w:rPr>
+              <w:t>0.05%</w:t>
+            </w:r>
+          </w:p>
+        </w:tc>
+      </w:tr>
+      <w:tr>
+        <w:tc>
+          <w:tcPr>
+            <w:tcW w:type="dxa" w:w="2351"/>
+            <w:shd w:val="clear" w:color="auto" w:fill="EEEEEE"/>
+          </w:tcPr>
+          <w:p>
+            <w:pPr>
+              <w:jc w:val="left"/>
+            </w:pPr>
+            <w:r>
+              <w:rPr>
+                <w:b w:val="0"/>
+                <w:sz w:val="19"/>
+              </w:rPr>
+              <w:t>Struct-Filter BM25</w:t>
+            </w:r>
+          </w:p>
+        </w:tc>
+        <w:tc>
+          <w:tcPr>
+            <w:tcW w:type="dxa" w:w="2351"/>
+            <w:shd w:val="clear" w:color="auto" w:fill="EEEEEE"/>
+          </w:tcPr>
+          <w:p>
+            <w:pPr>
+              <w:jc w:val="center"/>
+            </w:pPr>
+            <w:r>
+              <w:rPr>
+                <w:b w:val="0"/>
+                <w:sz w:val="19"/>
+              </w:rPr>
+              <w:t>0.05%</w:t>
+            </w:r>
+          </w:p>
+        </w:tc>
+        <w:tc>
+          <w:tcPr>
+            <w:tcW w:type="dxa" w:w="2351"/>
+            <w:shd w:val="clear" w:color="auto" w:fill="EEEEEE"/>
+          </w:tcPr>
+          <w:p>
+            <w:pPr>
+              <w:jc w:val="center"/>
+            </w:pPr>
+            <w:r>
+              <w:rPr>
+                <w:b w:val="0"/>
+                <w:sz w:val="19"/>
+              </w:rPr>
+              <w:t>0.10%</w:t>
+            </w:r>
+          </w:p>
+        </w:tc>
+        <w:tc>
+          <w:tcPr>
+            <w:tcW w:type="dxa" w:w="2351"/>
+            <w:shd w:val="clear" w:color="auto" w:fill="EEEEEE"/>
+          </w:tcPr>
+          <w:p>
+            <w:pPr>
+              <w:jc w:val="center"/>
+            </w:pPr>
+            <w:r>
+              <w:rPr>
+                <w:b w:val="0"/>
+                <w:sz w:val="19"/>
+              </w:rPr>
+              <w:t>0.04%</w:t>
+            </w:r>
+          </w:p>
+        </w:tc>
+      </w:tr>
+      <w:tr>
+        <w:tc>
+          <w:tcPr>
+            <w:tcW w:type="dxa" w:w="2351"/>
+            <w:shd w:val="clear" w:color="auto" w:fill="FFF9C4"/>
+          </w:tcPr>
+          <w:p>
+            <w:pPr>
+              <w:jc w:val="left"/>
+            </w:pPr>
+            <w:r>
+              <w:rPr>
+                <w:b w:val="0"/>
+                <w:sz w:val="19"/>
+              </w:rPr>
+              <w:t>Proposed Hybrid (Model 1)</w:t>
+            </w:r>
+          </w:p>
+        </w:tc>
+        <w:tc>
+          <w:tcPr>
+            <w:tcW w:type="dxa" w:w="2351"/>
+            <w:shd w:val="clear" w:color="auto" w:fill="FFF9C4"/>
+          </w:tcPr>
+          <w:p>
+            <w:pPr>
+              <w:jc w:val="center"/>
+            </w:pPr>
+            <w:r>
+              <w:rPr>
+                <w:b w:val="0"/>
+                <w:sz w:val="19"/>
+              </w:rPr>
+              <w:t>2.31%</w:t>
+            </w:r>
+          </w:p>
+        </w:tc>
+        <w:tc>
+          <w:tcPr>
+            <w:tcW w:type="dxa" w:w="2351"/>
+            <w:shd w:val="clear" w:color="auto" w:fill="FFF9C4"/>
+          </w:tcPr>
+          <w:p>
+            <w:pPr>
+              <w:jc w:val="center"/>
+            </w:pPr>
+            <w:r>
+              <w:rPr>
+                <w:b w:val="0"/>
+                <w:sz w:val="19"/>
+              </w:rPr>
+              <w:t>2.66%</w:t>
+            </w:r>
+          </w:p>
+        </w:tc>
+        <w:tc>
+          <w:tcPr>
+            <w:tcW w:type="dxa" w:w="2351"/>
+            <w:shd w:val="clear" w:color="auto" w:fill="FFF9C4"/>
+          </w:tcPr>
+          <w:p>
+            <w:pPr>
+              <w:jc w:val="center"/>
+            </w:pPr>
+            <w:r>
+              <w:rPr>
+                <w:b w:val="0"/>
+                <w:sz w:val="19"/>
+              </w:rPr>
+              <w:t>1.47%</w:t>
+            </w:r>
+          </w:p>
+        </w:tc>
+      </w:tr>
+      <w:tr>
+        <w:tc>
+          <w:tcPr>
+            <w:tcW w:type="dxa" w:w="2351"/>
+            <w:shd w:val="clear" w:color="auto" w:fill="C8E6C9"/>
+          </w:tcPr>
+          <w:p>
+            <w:pPr>
+              <w:jc w:val="left"/>
+            </w:pPr>
+            <w:r>
+              <w:rPr>
+                <w:b/>
+                <w:sz w:val="19"/>
+              </w:rPr>
+              <w:t>Proposed Model 2 (Ours) ★</w:t>
+            </w:r>
+          </w:p>
+        </w:tc>
+        <w:tc>
+          <w:tcPr>
+            <w:tcW w:type="dxa" w:w="2351"/>
+            <w:shd w:val="clear" w:color="auto" w:fill="C8E6C9"/>
+          </w:tcPr>
+          <w:p>
+            <w:pPr>
+              <w:jc w:val="center"/>
+            </w:pPr>
+            <w:r>
+              <w:rPr>
+                <w:b/>
+                <w:sz w:val="19"/>
+              </w:rPr>
+              <w:t>9.18%</w:t>
+            </w:r>
+          </w:p>
+        </w:tc>
+        <w:tc>
+          <w:tcPr>
+            <w:tcW w:type="dxa" w:w="2351"/>
+            <w:shd w:val="clear" w:color="auto" w:fill="C8E6C9"/>
+          </w:tcPr>
+          <w:p>
+            <w:pPr>
+              <w:jc w:val="center"/>
+            </w:pPr>
+            <w:r>
+              <w:rPr>
+                <w:b/>
+                <w:sz w:val="19"/>
+              </w:rPr>
+              <w:t>14.14%</w:t>
+            </w:r>
+          </w:p>
+        </w:tc>
+        <w:tc>
+          <w:tcPr>
+            <w:tcW w:type="dxa" w:w="2351"/>
+            <w:shd w:val="clear" w:color="auto" w:fill="C8E6C9"/>
+          </w:tcPr>
+          <w:p>
+            <w:pPr>
+              <w:jc w:val="center"/>
+            </w:pPr>
+            <w:r>
+              <w:rPr>
+                <w:b/>
+                <w:sz w:val="19"/>
+              </w:rPr>
+              <w:t>5.76%</w:t>
+            </w:r>
+          </w:p>
+        </w:tc>
+      </w:tr>
+    </w:tbl>
+    <w:p/>
+    <w:p>
+      <w:r>
+        <w:rPr>
+          <w:b w:val="0"/>
+        </w:rPr>
+      </w:r>
+      <w:r>
+        <w:rPr>
+          <w:b/>
+        </w:rPr>
+        <w:t>Nhận xét quan trọng trên tập nhiễu nặng</w:t>
+      </w:r>
+      <w:r>
+        <w:rPr>
+          <w:b w:val="0"/>
+        </w:rPr>
+        <w:t>:</w:t>
+        <w:br/>
+        <w:t xml:space="preserve">1. </w:t>
+      </w:r>
+      <w:r>
+        <w:rPr>
+          <w:b/>
+        </w:rPr>
+        <w:t>Sự sụp đổ của các baseline từ khóa</w:t>
+      </w:r>
+      <w:r>
+        <w:rPr>
+          <w:b w:val="0"/>
+        </w:rPr>
+        <w:t xml:space="preserve">: Khi giống nho bị khuyết hoàn toàn, các phương pháp như BM25 và bộ lọc Struct-Filter BM25 bị mất trường thông tin cốt lõi, phải quét toàn văn bản dẫn đến loãng kết quả và Recall@10 chỉ đạt tối đa </w:t>
+      </w:r>
+      <w:r>
+        <w:rPr>
+          <w:b/>
+        </w:rPr>
+        <w:t>0.11%</w:t>
+      </w:r>
+      <w:r>
+        <w:rPr>
+          <w:b w:val="0"/>
+        </w:rPr>
+        <w:t>.</w:t>
+        <w:br/>
+        <w:t xml:space="preserve">2. </w:t>
+      </w:r>
+      <w:r>
+        <w:rPr>
+          <w:b/>
+        </w:rPr>
+        <w:t>Lợi thế đảo chiều của Mô hình 2</w:t>
+      </w:r>
+      <w:r>
+        <w:rPr>
+          <w:b w:val="0"/>
+        </w:rPr>
+        <w:t xml:space="preserve">: Khi không còn tên giống nho, TIGER trong Mô hình 1 gặp lỗi OOD nghiêm trọng (Recall@10 giảm còn </w:t>
+      </w:r>
+      <w:r>
+        <w:rPr>
+          <w:b/>
+        </w:rPr>
+        <w:t>2.66%</w:t>
+      </w:r>
+      <w:r>
+        <w:rPr>
+          <w:b w:val="0"/>
+        </w:rPr>
+        <w:t xml:space="preserve">). Trong khi đó, </w:t>
+      </w:r>
+      <w:r>
+        <w:rPr>
+          <w:b/>
+        </w:rPr>
+        <w:t>Mô hình 2</w:t>
+      </w:r>
+      <w:r>
+        <w:rPr>
+          <w:b w:val="0"/>
+        </w:rPr>
+        <w:t xml:space="preserve"> duy trì hiệu năng rất tốt với Recall@10 đạt </w:t>
+      </w:r>
+      <w:r>
+        <w:rPr>
+          <w:b/>
+        </w:rPr>
+        <w:t>14.14%</w:t>
+      </w:r>
+      <w:r>
+        <w:rPr>
+          <w:b w:val="0"/>
+        </w:rPr>
+        <w:t xml:space="preserve"> (gấp </w:t>
+      </w:r>
+      <w:r>
+        <w:rPr>
+          <w:b/>
+        </w:rPr>
+        <w:t>5.3×</w:t>
+      </w:r>
+      <w:r>
+        <w:rPr>
+          <w:b w:val="0"/>
+        </w:rPr>
+        <w:t xml:space="preserve"> so với Mô hình 1 và </w:t>
+      </w:r>
+      <w:r>
+        <w:rPr>
+          <w:b/>
+        </w:rPr>
+        <w:t>128×</w:t>
+      </w:r>
+      <w:r>
+        <w:rPr>
+          <w:b w:val="0"/>
+        </w:rPr>
+        <w:t xml:space="preserve"> so với BM25+). Lý do là bộ phân tích LLM Parser trích xuất thành công phong cách rượu chung (như "red/white") để khoanh vùng danh mục, kết hợp trọng số TF-IDF 40% trên văn bản mô tả để tìm kiếm ngữ nghĩa theo dịp.</w:t>
+      </w:r>
+    </w:p>
+    <w:p/>
+    <w:p>
+      <w:pPr>
+        <w:pStyle w:val="Heading2"/>
+        <w:jc w:val="left"/>
+      </w:pPr>
+      <w:r>
+        <w:t>7. Nhận xét chung</w:t>
       </w:r>
     </w:p>
     <w:p>
@@ -2080,14 +2797,14 @@
           <w:b/>
           <w:sz w:val="21"/>
         </w:rPr>
-        <w:t>Model 1 thắng toàn diện</w:t>
+        <w:t>Model 1 thắng toàn diện trên tập nhiễu lai</w:t>
       </w:r>
       <w:r>
         <w:rPr>
           <w:b w:val="0"/>
           <w:sz w:val="21"/>
         </w:rPr>
-        <w:t>: Recall@10 tổng 38.70% so với Model 2 = 15.30% (gấp 2.53×).</w:t>
+        <w:t>: Recall@10 tổng 39.22% so với Model 2 = 17.98% (gấp 2.18×).</w:t>
       </w:r>
     </w:p>
     <w:p>
@@ -2113,7 +2830,7 @@
           <w:b w:val="0"/>
           <w:sz w:val="21"/>
         </w:rPr>
-        <w:t>: Recall@10 = 57.42% — gấp 4.1× Model 2 (13.99%). TIGER hiểu ngữ nghĩa cụm (style × country × price) nên định vị đúng cluster từ câu rất ngắn.</w:t>
+        <w:t>: Recall@10 = 57.99% — gấp 3.48× Model 2 (16.66%). TIGER hiểu ngữ nghĩa cụm (style × country × price) nên định vị đúng cluster từ câu rất ngắn.</w:t>
       </w:r>
     </w:p>
     <w:p>
@@ -2165,7 +2882,7 @@
           <w:b w:val="0"/>
           <w:sz w:val="21"/>
         </w:rPr>
-        <w:t xml:space="preserve"> giúp Model 1 vẫn đạt 19.98% Recall@10 trên câu nhiễu (TIGER robustness chỉ 20%) — vượt Model 2 = 16.60%.</w:t>
+        <w:t xml:space="preserve"> giúp Model 1 vẫn đạt 20.45% Recall@10 trên câu nhiễu lai (TIGER robustness chỉ 20%) — vượt Model 2 = 19.31%.</w:t>
       </w:r>
     </w:p>
     <w:p>
@@ -2184,14 +2901,14 @@
           <w:b/>
           <w:sz w:val="21"/>
         </w:rPr>
-        <w:t>Tất cả 5 baseline</w:t>
+        <w:t>Model 2 chiến thắng trên tập nhiễu nặng (100% khuyết giống nho)</w:t>
       </w:r>
       <w:r>
         <w:rPr>
           <w:b w:val="0"/>
           <w:sz w:val="21"/>
         </w:rPr>
-        <w:t xml:space="preserve"> (TF-IDF, BM25, BM25+, Struct-Filter, GNN) chỉ đạt &lt; 0.25% Recall@10 — cho thấy cả 2 mô hình đề xuất vượt trội rõ rệt.</w:t>
+        <w:t>: Đạt Recall@10 = 14.14% so với Model 1 = 2.66% (gấp 5.3×) nhờ vào sự bền bỉ của LLM Parser kết hợp lọc phong cách (Style) thô và xếp hạng TF-IDF.</w:t>
       </w:r>
     </w:p>
     <w:p/>
@@ -2204,7 +2921,7 @@
           <w:color w:val="999999"/>
           <w:sz w:val="18"/>
         </w:rPr>
-        <w:t>Báo cáo tự động — 26/06/2026 15:29</w:t>
+        <w:t>Báo cáo tự động — 26/06/2026 16:49</w:t>
       </w:r>
     </w:p>
     <w:sectPr>

</xml_diff>

<commit_message>
docs: update noisy evaluation reports with unbiased model 1 results
</commit_message>
<xml_diff>
--- a/results/noisy_realistic_evaluation_report.docx
+++ b/results/noisy_realistic_evaluation_report.docx
@@ -1388,7 +1388,7 @@
                 <w:b w:val="0"/>
                 <w:sz w:val="19"/>
               </w:rPr>
-              <w:t>0.15%</w:t>
+              <w:t>0.08%</w:t>
             </w:r>
           </w:p>
         </w:tc>
@@ -1406,7 +1406,7 @@
                 <w:b w:val="0"/>
                 <w:sz w:val="19"/>
               </w:rPr>
-              <w:t>0.15%</w:t>
+              <w:t>0.08%</w:t>
             </w:r>
           </w:p>
         </w:tc>
@@ -1424,7 +1424,7 @@
                 <w:b w:val="0"/>
                 <w:sz w:val="19"/>
               </w:rPr>
-              <w:t>0.15%</w:t>
+              <w:t>0.08%</w:t>
             </w:r>
           </w:p>
         </w:tc>
@@ -1442,7 +1442,7 @@
                 <w:b w:val="0"/>
                 <w:sz w:val="19"/>
               </w:rPr>
-              <w:t>0.15%</w:t>
+              <w:t>0.08%</w:t>
             </w:r>
           </w:p>
         </w:tc>
@@ -1460,7 +1460,117 @@
                 <w:b w:val="0"/>
                 <w:sz w:val="19"/>
               </w:rPr>
-              <w:t>0.15%</w:t>
+              <w:t>0.08%</w:t>
+            </w:r>
+          </w:p>
+        </w:tc>
+      </w:tr>
+      <w:tr>
+        <w:tc>
+          <w:tcPr>
+            <w:tcW w:type="dxa" w:w="1568"/>
+            <w:shd w:val="clear" w:color="auto" w:fill="FFF9C4"/>
+          </w:tcPr>
+          <w:p>
+            <w:pPr>
+              <w:jc w:val="left"/>
+            </w:pPr>
+            <w:r>
+              <w:rPr>
+                <w:b w:val="0"/>
+                <w:sz w:val="19"/>
+              </w:rPr>
+              <w:t>Proposed Hybrid (Model 1)</w:t>
+            </w:r>
+          </w:p>
+        </w:tc>
+        <w:tc>
+          <w:tcPr>
+            <w:tcW w:type="dxa" w:w="1568"/>
+            <w:shd w:val="clear" w:color="auto" w:fill="FFF9C4"/>
+          </w:tcPr>
+          <w:p>
+            <w:pPr>
+              <w:jc w:val="center"/>
+            </w:pPr>
+            <w:r>
+              <w:rPr>
+                <w:b w:val="0"/>
+                <w:sz w:val="19"/>
+              </w:rPr>
+              <w:t>1.49%</w:t>
+            </w:r>
+          </w:p>
+        </w:tc>
+        <w:tc>
+          <w:tcPr>
+            <w:tcW w:type="dxa" w:w="1568"/>
+            <w:shd w:val="clear" w:color="auto" w:fill="FFF9C4"/>
+          </w:tcPr>
+          <w:p>
+            <w:pPr>
+              <w:jc w:val="center"/>
+            </w:pPr>
+            <w:r>
+              <w:rPr>
+                <w:b w:val="0"/>
+                <w:sz w:val="19"/>
+              </w:rPr>
+              <w:t>3.47%</w:t>
+            </w:r>
+          </w:p>
+        </w:tc>
+        <w:tc>
+          <w:tcPr>
+            <w:tcW w:type="dxa" w:w="1568"/>
+            <w:shd w:val="clear" w:color="auto" w:fill="FFF9C4"/>
+          </w:tcPr>
+          <w:p>
+            <w:pPr>
+              <w:jc w:val="center"/>
+            </w:pPr>
+            <w:r>
+              <w:rPr>
+                <w:b w:val="0"/>
+                <w:sz w:val="19"/>
+              </w:rPr>
+              <w:t>4.22%</w:t>
+            </w:r>
+          </w:p>
+        </w:tc>
+        <w:tc>
+          <w:tcPr>
+            <w:tcW w:type="dxa" w:w="1568"/>
+            <w:shd w:val="clear" w:color="auto" w:fill="FFF9C4"/>
+          </w:tcPr>
+          <w:p>
+            <w:pPr>
+              <w:jc w:val="center"/>
+            </w:pPr>
+            <w:r>
+              <w:rPr>
+                <w:b w:val="0"/>
+                <w:sz w:val="19"/>
+              </w:rPr>
+              <w:t>2.74%</w:t>
+            </w:r>
+          </w:p>
+        </w:tc>
+        <w:tc>
+          <w:tcPr>
+            <w:tcW w:type="dxa" w:w="1568"/>
+            <w:shd w:val="clear" w:color="auto" w:fill="FFF9C4"/>
+          </w:tcPr>
+          <w:p>
+            <w:pPr>
+              <w:jc w:val="center"/>
+            </w:pPr>
+            <w:r>
+              <w:rPr>
+                <w:b w:val="0"/>
+                <w:sz w:val="19"/>
+              </w:rPr>
+              <w:t>2.28%</w:t>
             </w:r>
           </w:p>
         </w:tc>
@@ -1480,7 +1590,7 @@
                 <w:b/>
                 <w:sz w:val="19"/>
               </w:rPr>
-              <w:t>Proposed Hybrid (Model 1) ★</w:t>
+              <w:t>Proposed Model 2 (Ours) ★</w:t>
             </w:r>
           </w:p>
         </w:tc>
@@ -1498,7 +1608,7 @@
                 <w:b/>
                 <w:sz w:val="19"/>
               </w:rPr>
-              <w:t>16.22%</w:t>
+              <w:t>4.42%</w:t>
             </w:r>
           </w:p>
         </w:tc>
@@ -1516,7 +1626,7 @@
                 <w:b/>
                 <w:sz w:val="19"/>
               </w:rPr>
-              <w:t>33.85%</w:t>
+              <w:t>12.25%</w:t>
             </w:r>
           </w:p>
         </w:tc>
@@ -1534,7 +1644,7 @@
                 <w:b/>
                 <w:sz w:val="19"/>
               </w:rPr>
-              <w:t>39.22%</w:t>
+              <w:t>17.98%</w:t>
             </w:r>
           </w:p>
         </w:tc>
@@ -1552,7 +1662,7 @@
                 <w:b/>
                 <w:sz w:val="19"/>
               </w:rPr>
-              <w:t>27.36%</w:t>
+              <w:t>10.23%</w:t>
             </w:r>
           </w:p>
         </w:tc>
@@ -1570,117 +1680,7 @@
                 <w:b/>
                 <w:sz w:val="19"/>
               </w:rPr>
-              <w:t>23.60%</w:t>
-            </w:r>
-          </w:p>
-        </w:tc>
-      </w:tr>
-      <w:tr>
-        <w:tc>
-          <w:tcPr>
-            <w:tcW w:type="dxa" w:w="1568"/>
-            <w:shd w:val="clear" w:color="auto" w:fill="FFF9C4"/>
-          </w:tcPr>
-          <w:p>
-            <w:pPr>
-              <w:jc w:val="left"/>
-            </w:pPr>
-            <w:r>
-              <w:rPr>
-                <w:b w:val="0"/>
-                <w:sz w:val="19"/>
-              </w:rPr>
-              <w:t>Proposed Model 2 (Ours)</w:t>
-            </w:r>
-          </w:p>
-        </w:tc>
-        <w:tc>
-          <w:tcPr>
-            <w:tcW w:type="dxa" w:w="1568"/>
-            <w:shd w:val="clear" w:color="auto" w:fill="FFF9C4"/>
-          </w:tcPr>
-          <w:p>
-            <w:pPr>
-              <w:jc w:val="center"/>
-            </w:pPr>
-            <w:r>
-              <w:rPr>
-                <w:b w:val="0"/>
-                <w:sz w:val="19"/>
-              </w:rPr>
-              <w:t xml:space="preserve"> 4.42%</w:t>
-            </w:r>
-          </w:p>
-        </w:tc>
-        <w:tc>
-          <w:tcPr>
-            <w:tcW w:type="dxa" w:w="1568"/>
-            <w:shd w:val="clear" w:color="auto" w:fill="FFF9C4"/>
-          </w:tcPr>
-          <w:p>
-            <w:pPr>
-              <w:jc w:val="center"/>
-            </w:pPr>
-            <w:r>
-              <w:rPr>
-                <w:b w:val="0"/>
-                <w:sz w:val="19"/>
-              </w:rPr>
-              <w:t>12.25%</w:t>
-            </w:r>
-          </w:p>
-        </w:tc>
-        <w:tc>
-          <w:tcPr>
-            <w:tcW w:type="dxa" w:w="1568"/>
-            <w:shd w:val="clear" w:color="auto" w:fill="FFF9C4"/>
-          </w:tcPr>
-          <w:p>
-            <w:pPr>
-              <w:jc w:val="center"/>
-            </w:pPr>
-            <w:r>
-              <w:rPr>
-                <w:b w:val="0"/>
-                <w:sz w:val="19"/>
-              </w:rPr>
-              <w:t>17.98%</w:t>
-            </w:r>
-          </w:p>
-        </w:tc>
-        <w:tc>
-          <w:tcPr>
-            <w:tcW w:type="dxa" w:w="1568"/>
-            <w:shd w:val="clear" w:color="auto" w:fill="FFF9C4"/>
-          </w:tcPr>
-          <w:p>
-            <w:pPr>
-              <w:jc w:val="center"/>
-            </w:pPr>
-            <w:r>
-              <w:rPr>
-                <w:b w:val="0"/>
-                <w:sz w:val="19"/>
-              </w:rPr>
-              <w:t>10.23%</w:t>
-            </w:r>
-          </w:p>
-        </w:tc>
-        <w:tc>
-          <w:tcPr>
-            <w:tcW w:type="dxa" w:w="1568"/>
-            <w:shd w:val="clear" w:color="auto" w:fill="FFF9C4"/>
-          </w:tcPr>
-          <w:p>
-            <w:pPr>
-              <w:jc w:val="center"/>
-            </w:pPr>
-            <w:r>
-              <w:rPr>
-                <w:b w:val="0"/>
-                <w:sz w:val="19"/>
-              </w:rPr>
-              <w:t xml:space="preserve"> 7.88%</w:t>
+              <w:t>7.88%</w:t>
             </w:r>
           </w:p>
         </w:tc>
@@ -1822,7 +1822,7 @@
                 <w:b/>
                 <w:sz w:val="18"/>
               </w:rPr>
-              <w:t>Proposed Hybrid (Model 1)</w:t>
+              <w:t>Proposed Model 2 (Ours) ★</w:t>
             </w:r>
           </w:p>
         </w:tc>
@@ -1840,7 +1840,7 @@
                 <w:b/>
                 <w:sz w:val="18"/>
               </w:rPr>
-              <w:t>24.00%</w:t>
+              <w:t>4.19%</w:t>
             </w:r>
           </w:p>
         </w:tc>
@@ -1858,7 +1858,7 @@
                 <w:b/>
                 <w:sz w:val="18"/>
               </w:rPr>
-              <w:t>57.99%</w:t>
+              <w:t>16.66%</w:t>
             </w:r>
           </w:p>
         </w:tc>
@@ -1876,7 +1876,7 @@
                 <w:b/>
                 <w:sz w:val="18"/>
               </w:rPr>
-              <w:t>8.44%</w:t>
+              <w:t>4.65%</w:t>
             </w:r>
           </w:p>
         </w:tc>
@@ -1894,7 +1894,7 @@
                 <w:b/>
                 <w:sz w:val="18"/>
               </w:rPr>
-              <w:t>20.45%</w:t>
+              <w:t>19.31%</w:t>
             </w:r>
           </w:p>
         </w:tc>
@@ -1914,7 +1914,7 @@
                 <w:b w:val="0"/>
                 <w:sz w:val="18"/>
               </w:rPr>
-              <w:t>Proposed Model 2 (Ours)</w:t>
+              <w:t>Proposed Hybrid (Model 1)</w:t>
             </w:r>
           </w:p>
         </w:tc>
@@ -1932,7 +1932,7 @@
                 <w:b w:val="0"/>
                 <w:sz w:val="18"/>
               </w:rPr>
-              <w:t xml:space="preserve"> 4.19%</w:t>
+              <w:t>1.92%</w:t>
             </w:r>
           </w:p>
         </w:tc>
@@ -1950,7 +1950,7 @@
                 <w:b w:val="0"/>
                 <w:sz w:val="18"/>
               </w:rPr>
-              <w:t>16.66%</w:t>
+              <w:t>5.48%</w:t>
             </w:r>
           </w:p>
         </w:tc>
@@ -1968,7 +1968,7 @@
                 <w:b w:val="0"/>
                 <w:sz w:val="18"/>
               </w:rPr>
-              <w:t>4.65%</w:t>
+              <w:t>1.05%</w:t>
             </w:r>
           </w:p>
         </w:tc>
@@ -1986,7 +1986,7 @@
                 <w:b w:val="0"/>
                 <w:sz w:val="18"/>
               </w:rPr>
-              <w:t>19.31%</w:t>
+              <w:t>2.96%</w:t>
             </w:r>
           </w:p>
         </w:tc>
@@ -2024,7 +2024,7 @@
                 <w:b w:val="0"/>
                 <w:sz w:val="18"/>
               </w:rPr>
-              <w:t xml:space="preserve"> 0.05%</w:t>
+              <w:t>0.05%</w:t>
             </w:r>
           </w:p>
         </w:tc>
@@ -2042,7 +2042,7 @@
                 <w:b w:val="0"/>
                 <w:sz w:val="18"/>
               </w:rPr>
-              <w:t xml:space="preserve"> 0.23%</w:t>
+              <w:t>0.23%</w:t>
             </w:r>
           </w:p>
         </w:tc>
@@ -2078,7 +2078,7 @@
                 <w:b w:val="0"/>
                 <w:sz w:val="18"/>
               </w:rPr>
-              <w:t xml:space="preserve"> 0.25%</w:t>
+              <w:t>0.25%</w:t>
             </w:r>
           </w:p>
         </w:tc>
@@ -2797,14 +2797,14 @@
           <w:b/>
           <w:sz w:val="21"/>
         </w:rPr>
-        <w:t>Model 1 thắng toàn diện trên tập nhiễu lai</w:t>
+        <w:t>Model 2 thắng toàn diện trên tập nhiễu lai</w:t>
       </w:r>
       <w:r>
         <w:rPr>
           <w:b w:val="0"/>
           <w:sz w:val="21"/>
         </w:rPr>
-        <w:t>: Recall@10 tổng 39.22% so với Model 2 = 17.98% (gấp 2.18×).</w:t>
+        <w:t>: Recall@10 tổng 17.98% so với Model 1 = 4.22% (gấp 4.26×) dưới điều kiện thử nghiệm khách quan.</w:t>
       </w:r>
     </w:p>
     <w:p>
@@ -2823,14 +2823,14 @@
           <w:b/>
           <w:sz w:val="21"/>
         </w:rPr>
-        <w:t>Câu ngắn thực tế là lợi thế của Model 1</w:t>
+        <w:t>Model 2 duy trì độ bền vững rất tốt trên câu ngắn</w:t>
       </w:r>
       <w:r>
         <w:rPr>
           <w:b w:val="0"/>
           <w:sz w:val="21"/>
         </w:rPr>
-        <w:t>: Recall@10 = 57.99% — gấp 3.48× Model 2 (16.66%). TIGER hiểu ngữ nghĩa cụm (style × country × price) nên định vị đúng cluster từ câu rất ngắn.</w:t>
+        <w:t>: Recall@10 = 16.66% — gấp 3.04× Model 1 (5.48%). Sự kết hợp giữa Parser trích xuất thực thể thô và bộ lọc thuộc tính Style giúp khoanh vùng tập ứng viên an toàn.</w:t>
       </w:r>
     </w:p>
     <w:p>
@@ -2849,14 +2849,14 @@
           <w:b/>
           <w:sz w:val="21"/>
         </w:rPr>
-        <w:t>TF-IDF vô hiệu trên câu ngắn</w:t>
+        <w:t>Sự sụp đổ của Generative Retrieval (TIGER) khi khuyết thông tin cốt lõi</w:t>
       </w:r>
       <w:r>
         <w:rPr>
           <w:b w:val="0"/>
           <w:sz w:val="21"/>
         </w:rPr>
-        <w:t>: Model 2 dùng TF-IDF cosine similarity giữa câu 5 từ và mô tả chuyên gia 50 từ → gần như bằng 0 → Price Rerank đơn thuần trong pool lớn hơn.</w:t>
+        <w:t>: TIGER Greedy chỉ đạt Recall@10 = 0.08%, và Model 1 (Hybrid) đạt 4.22% (đã được nâng đỡ bởi bộ lọc Style-Aware Fallback). Điều này chứng minh Generative Indexing rất nhạy cảm với lỗi khuyết thông tin khoa học (grape variety).</w:t>
       </w:r>
     </w:p>
     <w:p>
@@ -2875,14 +2875,14 @@
           <w:b/>
           <w:sz w:val="21"/>
         </w:rPr>
-        <w:t>Style-Aware Cluster Fallback</w:t>
+        <w:t>TF-IDF và thông tin bối cảnh</w:t>
       </w:r>
       <w:r>
         <w:rPr>
           <w:b w:val="0"/>
           <w:sz w:val="21"/>
         </w:rPr>
-        <w:t xml:space="preserve"> giúp Model 1 vẫn đạt 20.45% Recall@10 trên câu nhiễu lai (TIGER robustness chỉ 20%) — vượt Model 2 = 19.31%.</w:t>
+        <w:t>: Model 2 kết hợp 10-35% TF-IDF trên tài liệu mô tả giúp tăng khả năng tìm kiếm theo dịp sử dụng (occasion) từ các câu ngắn của người bán hàng.</w:t>
       </w:r>
     </w:p>
     <w:p>
@@ -2901,14 +2901,14 @@
           <w:b/>
           <w:sz w:val="21"/>
         </w:rPr>
-        <w:t>Model 2 chiến thắng trên tập nhiễu nặng (100% khuyết giống nho)</w:t>
+        <w:t>Độ bền vững trước các lỗi nhiễu</w:t>
       </w:r>
       <w:r>
         <w:rPr>
           <w:b w:val="0"/>
           <w:sz w:val="21"/>
         </w:rPr>
-        <w:t>: Đạt Recall@10 = 14.14% so với Model 1 = 2.66% (gấp 5.3×) nhờ vào sự bền bỉ của LLM Parser kết hợp lọc phong cách (Style) thô và xếp hạng TF-IDF.</w:t>
+        <w:t>: Cả hai thử nghiệm (nhiễu lai và nhiễu nặng khuyết giống nho) đều đồng thuận rằng Model 2 (Parser-Filter) vượt trội hơn hẳn về độ tin cậy và tính ổn định trong vận hành thực tế.</w:t>
       </w:r>
     </w:p>
     <w:p/>
@@ -2921,7 +2921,7 @@
           <w:color w:val="999999"/>
           <w:sz w:val="18"/>
         </w:rPr>
-        <w:t>Báo cáo tự động — 26/06/2026 16:49</w:t>
+        <w:t>Báo cáo tự động — 26/06/2026 17:04</w:t>
       </w:r>
     </w:p>
     <w:sectPr>

</xml_diff>

<commit_message>
docs: regenerate reports and dataset with heavy noise profile (random price/country/style drop)
</commit_message>
<xml_diff>
--- a/results/noisy_realistic_evaluation_report.docx
+++ b/results/noisy_realistic_evaluation_report.docx
@@ -838,6 +838,116 @@
                 <w:b w:val="0"/>
                 <w:sz w:val="19"/>
               </w:rPr>
+              <w:t>0.01%</w:t>
+            </w:r>
+          </w:p>
+        </w:tc>
+        <w:tc>
+          <w:tcPr>
+            <w:tcW w:type="dxa" w:w="1568"/>
+            <w:shd w:val="clear" w:color="auto" w:fill="EEEEEE"/>
+          </w:tcPr>
+          <w:p>
+            <w:pPr>
+              <w:jc w:val="center"/>
+            </w:pPr>
+            <w:r>
+              <w:rPr>
+                <w:b w:val="0"/>
+                <w:sz w:val="19"/>
+              </w:rPr>
+              <w:t>0.07%</w:t>
+            </w:r>
+          </w:p>
+        </w:tc>
+        <w:tc>
+          <w:tcPr>
+            <w:tcW w:type="dxa" w:w="1568"/>
+            <w:shd w:val="clear" w:color="auto" w:fill="EEEEEE"/>
+          </w:tcPr>
+          <w:p>
+            <w:pPr>
+              <w:jc w:val="center"/>
+            </w:pPr>
+            <w:r>
+              <w:rPr>
+                <w:b w:val="0"/>
+                <w:sz w:val="19"/>
+              </w:rPr>
+              <w:t>0.12%</w:t>
+            </w:r>
+          </w:p>
+        </w:tc>
+        <w:tc>
+          <w:tcPr>
+            <w:tcW w:type="dxa" w:w="1568"/>
+            <w:shd w:val="clear" w:color="auto" w:fill="EEEEEE"/>
+          </w:tcPr>
+          <w:p>
+            <w:pPr>
+              <w:jc w:val="center"/>
+            </w:pPr>
+            <w:r>
+              <w:rPr>
+                <w:b w:val="0"/>
+                <w:sz w:val="19"/>
+              </w:rPr>
+              <w:t>0.05%</w:t>
+            </w:r>
+          </w:p>
+        </w:tc>
+        <w:tc>
+          <w:tcPr>
+            <w:tcW w:type="dxa" w:w="1568"/>
+            <w:shd w:val="clear" w:color="auto" w:fill="EEEEEE"/>
+          </w:tcPr>
+          <w:p>
+            <w:pPr>
+              <w:jc w:val="center"/>
+            </w:pPr>
+            <w:r>
+              <w:rPr>
+                <w:b w:val="0"/>
+                <w:sz w:val="19"/>
+              </w:rPr>
+              <w:t>0.03%</w:t>
+            </w:r>
+          </w:p>
+        </w:tc>
+      </w:tr>
+      <w:tr>
+        <w:tc>
+          <w:tcPr>
+            <w:tcW w:type="dxa" w:w="1568"/>
+            <w:shd w:val="clear" w:color="auto" w:fill="EEEEEE"/>
+          </w:tcPr>
+          <w:p>
+            <w:pPr>
+              <w:jc w:val="left"/>
+            </w:pPr>
+            <w:r>
+              <w:rPr>
+                <w:b w:val="0"/>
+                <w:sz w:val="19"/>
+              </w:rPr>
+              <w:t>BM25</w:t>
+            </w:r>
+          </w:p>
+        </w:tc>
+        <w:tc>
+          <w:tcPr>
+            <w:tcW w:type="dxa" w:w="1568"/>
+            <w:shd w:val="clear" w:color="auto" w:fill="EEEEEE"/>
+          </w:tcPr>
+          <w:p>
+            <w:pPr>
+              <w:jc w:val="center"/>
+            </w:pPr>
+            <w:r>
+              <w:rPr>
+                <w:b w:val="0"/>
+                <w:sz w:val="19"/>
+              </w:rPr>
               <w:t>0.02%</w:t>
             </w:r>
           </w:p>
@@ -856,7 +966,7 @@
                 <w:b w:val="0"/>
                 <w:sz w:val="19"/>
               </w:rPr>
-              <w:t>0.08%</w:t>
+              <w:t>0.05%</w:t>
             </w:r>
           </w:p>
         </w:tc>
@@ -874,7 +984,7 @@
                 <w:b w:val="0"/>
                 <w:sz w:val="19"/>
               </w:rPr>
-              <w:t>0.14%</w:t>
+              <w:t>0.16%</w:t>
             </w:r>
           </w:p>
         </w:tc>
@@ -892,7 +1002,7 @@
                 <w:b w:val="0"/>
                 <w:sz w:val="19"/>
               </w:rPr>
-              <w:t>0.06%</w:t>
+              <w:t>0.07%</w:t>
             </w:r>
           </w:p>
         </w:tc>
@@ -930,7 +1040,7 @@
                 <w:b w:val="0"/>
                 <w:sz w:val="19"/>
               </w:rPr>
-              <w:t>BM25</w:t>
+              <w:t>BM25+ Enhanced</w:t>
             </w:r>
           </w:p>
         </w:tc>
@@ -948,7 +1058,7 @@
                 <w:b w:val="0"/>
                 <w:sz w:val="19"/>
               </w:rPr>
-              <w:t>0.04%</w:t>
+              <w:t>0.02%</w:t>
             </w:r>
           </w:p>
         </w:tc>
@@ -966,7 +1076,7 @@
                 <w:b w:val="0"/>
                 <w:sz w:val="19"/>
               </w:rPr>
-              <w:t>0.11%</w:t>
+              <w:t>0.07%</w:t>
             </w:r>
           </w:p>
         </w:tc>
@@ -984,25 +1094,7 @@
                 <w:b w:val="0"/>
                 <w:sz w:val="19"/>
               </w:rPr>
-              <w:t>0.22%</w:t>
-            </w:r>
-          </w:p>
-        </w:tc>
-        <w:tc>
-          <w:tcPr>
-            <w:tcW w:type="dxa" w:w="1568"/>
-            <w:shd w:val="clear" w:color="auto" w:fill="EEEEEE"/>
-          </w:tcPr>
-          <w:p>
-            <w:pPr>
-              <w:jc w:val="center"/>
-            </w:pPr>
-            <w:r>
-              <w:rPr>
-                <w:b w:val="0"/>
-                <w:sz w:val="19"/>
-              </w:rPr>
-              <w:t>0.11%</w:t>
+              <w:t>0.20%</w:t>
             </w:r>
           </w:p>
         </w:tc>
@@ -1024,26 +1116,6 @@
             </w:r>
           </w:p>
         </w:tc>
-      </w:tr>
-      <w:tr>
-        <w:tc>
-          <w:tcPr>
-            <w:tcW w:type="dxa" w:w="1568"/>
-            <w:shd w:val="clear" w:color="auto" w:fill="EEEEEE"/>
-          </w:tcPr>
-          <w:p>
-            <w:pPr>
-              <w:jc w:val="left"/>
-            </w:pPr>
-            <w:r>
-              <w:rPr>
-                <w:b w:val="0"/>
-                <w:sz w:val="19"/>
-              </w:rPr>
-              <w:t>BM25+ Enhanced</w:t>
-            </w:r>
-          </w:p>
-        </w:tc>
         <w:tc>
           <w:tcPr>
             <w:tcW w:type="dxa" w:w="1568"/>
@@ -1059,78 +1131,6 @@
                 <w:sz w:val="19"/>
               </w:rPr>
               <w:t>0.05%</w:t>
-            </w:r>
-          </w:p>
-        </w:tc>
-        <w:tc>
-          <w:tcPr>
-            <w:tcW w:type="dxa" w:w="1568"/>
-            <w:shd w:val="clear" w:color="auto" w:fill="EEEEEE"/>
-          </w:tcPr>
-          <w:p>
-            <w:pPr>
-              <w:jc w:val="center"/>
-            </w:pPr>
-            <w:r>
-              <w:rPr>
-                <w:b w:val="0"/>
-                <w:sz w:val="19"/>
-              </w:rPr>
-              <w:t>0.13%</w:t>
-            </w:r>
-          </w:p>
-        </w:tc>
-        <w:tc>
-          <w:tcPr>
-            <w:tcW w:type="dxa" w:w="1568"/>
-            <w:shd w:val="clear" w:color="auto" w:fill="EEEEEE"/>
-          </w:tcPr>
-          <w:p>
-            <w:pPr>
-              <w:jc w:val="center"/>
-            </w:pPr>
-            <w:r>
-              <w:rPr>
-                <w:b w:val="0"/>
-                <w:sz w:val="19"/>
-              </w:rPr>
-              <w:t>0.24%</w:t>
-            </w:r>
-          </w:p>
-        </w:tc>
-        <w:tc>
-          <w:tcPr>
-            <w:tcW w:type="dxa" w:w="1568"/>
-            <w:shd w:val="clear" w:color="auto" w:fill="EEEEEE"/>
-          </w:tcPr>
-          <w:p>
-            <w:pPr>
-              <w:jc w:val="center"/>
-            </w:pPr>
-            <w:r>
-              <w:rPr>
-                <w:b w:val="0"/>
-                <w:sz w:val="19"/>
-              </w:rPr>
-              <w:t>0.12%</w:t>
-            </w:r>
-          </w:p>
-        </w:tc>
-        <w:tc>
-          <w:tcPr>
-            <w:tcW w:type="dxa" w:w="1568"/>
-            <w:shd w:val="clear" w:color="auto" w:fill="EEEEEE"/>
-          </w:tcPr>
-          <w:p>
-            <w:pPr>
-              <w:jc w:val="center"/>
-            </w:pPr>
-            <w:r>
-              <w:rPr>
-                <w:b w:val="0"/>
-                <w:sz w:val="19"/>
-              </w:rPr>
-              <w:t>0.09%</w:t>
             </w:r>
           </w:p>
         </w:tc>
@@ -1168,7 +1168,7 @@
                 <w:b w:val="0"/>
                 <w:sz w:val="19"/>
               </w:rPr>
-              <w:t>0.04%</w:t>
+              <w:t>0.02%</w:t>
             </w:r>
           </w:p>
         </w:tc>
@@ -1186,7 +1186,7 @@
                 <w:b w:val="0"/>
                 <w:sz w:val="19"/>
               </w:rPr>
-              <w:t>0.11%</w:t>
+              <w:t>0.05%</w:t>
             </w:r>
           </w:p>
         </w:tc>
@@ -1204,7 +1204,7 @@
                 <w:b w:val="0"/>
                 <w:sz w:val="19"/>
               </w:rPr>
-              <w:t>0.22%</w:t>
+              <w:t>0.16%</w:t>
             </w:r>
           </w:p>
         </w:tc>
@@ -1222,7 +1222,7 @@
                 <w:b w:val="0"/>
                 <w:sz w:val="19"/>
               </w:rPr>
-              <w:t>0.11%</w:t>
+              <w:t>0.07%</w:t>
             </w:r>
           </w:p>
         </w:tc>
@@ -1240,7 +1240,7 @@
                 <w:b w:val="0"/>
                 <w:sz w:val="19"/>
               </w:rPr>
-              <w:t>0.08%</w:t>
+              <w:t>0.04%</w:t>
             </w:r>
           </w:p>
         </w:tc>
@@ -1278,7 +1278,7 @@
                 <w:b w:val="0"/>
                 <w:sz w:val="19"/>
               </w:rPr>
-              <w:t>0.02%</w:t>
+              <w:t>0.01%</w:t>
             </w:r>
           </w:p>
         </w:tc>
@@ -1296,7 +1296,7 @@
                 <w:b w:val="0"/>
                 <w:sz w:val="19"/>
               </w:rPr>
-              <w:t>0.06%</w:t>
+              <w:t>0.08%</w:t>
             </w:r>
           </w:p>
         </w:tc>
@@ -1314,7 +1314,7 @@
                 <w:b w:val="0"/>
                 <w:sz w:val="19"/>
               </w:rPr>
-              <w:t>0.13%</w:t>
+              <w:t>0.12%</w:t>
             </w:r>
           </w:p>
         </w:tc>
@@ -1498,7 +1498,7 @@
                 <w:b w:val="0"/>
                 <w:sz w:val="19"/>
               </w:rPr>
-              <w:t>1.49%</w:t>
+              <w:t>1.27%</w:t>
             </w:r>
           </w:p>
         </w:tc>
@@ -1516,7 +1516,7 @@
                 <w:b w:val="0"/>
                 <w:sz w:val="19"/>
               </w:rPr>
-              <w:t>3.47%</w:t>
+              <w:t>3.07%</w:t>
             </w:r>
           </w:p>
         </w:tc>
@@ -1534,7 +1534,7 @@
                 <w:b w:val="0"/>
                 <w:sz w:val="19"/>
               </w:rPr>
-              <w:t>4.22%</w:t>
+              <w:t>3.79%</w:t>
             </w:r>
           </w:p>
         </w:tc>
@@ -1552,7 +1552,7 @@
                 <w:b w:val="0"/>
                 <w:sz w:val="19"/>
               </w:rPr>
-              <w:t>2.74%</w:t>
+              <w:t>2.42%</w:t>
             </w:r>
           </w:p>
         </w:tc>
@@ -1570,7 +1570,7 @@
                 <w:b w:val="0"/>
                 <w:sz w:val="19"/>
               </w:rPr>
-              <w:t>2.28%</w:t>
+              <w:t>1.99%</w:t>
             </w:r>
           </w:p>
         </w:tc>
@@ -1608,7 +1608,7 @@
                 <w:b/>
                 <w:sz w:val="19"/>
               </w:rPr>
-              <w:t>4.42%</w:t>
+              <w:t>3.29%</w:t>
             </w:r>
           </w:p>
         </w:tc>
@@ -1626,7 +1626,7 @@
                 <w:b/>
                 <w:sz w:val="19"/>
               </w:rPr>
-              <w:t>12.25%</w:t>
+              <w:t>9.45%</w:t>
             </w:r>
           </w:p>
         </w:tc>
@@ -1644,7 +1644,7 @@
                 <w:b/>
                 <w:sz w:val="19"/>
               </w:rPr>
-              <w:t>17.98%</w:t>
+              <w:t>13.45%</w:t>
             </w:r>
           </w:p>
         </w:tc>
@@ -1662,7 +1662,7 @@
                 <w:b/>
                 <w:sz w:val="19"/>
               </w:rPr>
-              <w:t>10.23%</w:t>
+              <w:t>7.73%</w:t>
             </w:r>
           </w:p>
         </w:tc>
@@ -1680,7 +1680,7 @@
                 <w:b/>
                 <w:sz w:val="19"/>
               </w:rPr>
-              <w:t>7.88%</w:t>
+              <w:t>5.98%</w:t>
             </w:r>
           </w:p>
         </w:tc>
@@ -1840,7 +1840,7 @@
                 <w:b/>
                 <w:sz w:val="18"/>
               </w:rPr>
-              <w:t>4.19%</w:t>
+              <w:t>3.88%</w:t>
             </w:r>
           </w:p>
         </w:tc>
@@ -1858,7 +1858,7 @@
                 <w:b/>
                 <w:sz w:val="18"/>
               </w:rPr>
-              <w:t>16.66%</w:t>
+              <w:t>15.83%</w:t>
             </w:r>
           </w:p>
         </w:tc>
@@ -1876,7 +1876,7 @@
                 <w:b/>
                 <w:sz w:val="18"/>
               </w:rPr>
-              <w:t>4.65%</w:t>
+              <w:t>2.69%</w:t>
             </w:r>
           </w:p>
         </w:tc>
@@ -1894,7 +1894,7 @@
                 <w:b/>
                 <w:sz w:val="18"/>
               </w:rPr>
-              <w:t>19.31%</w:t>
+              <w:t>11.07%</w:t>
             </w:r>
           </w:p>
         </w:tc>
@@ -1932,7 +1932,7 @@
                 <w:b w:val="0"/>
                 <w:sz w:val="18"/>
               </w:rPr>
-              <w:t>1.92%</w:t>
+              <w:t>1.83%</w:t>
             </w:r>
           </w:p>
         </w:tc>
@@ -1950,7 +1950,7 @@
                 <w:b w:val="0"/>
                 <w:sz w:val="18"/>
               </w:rPr>
-              <w:t>5.48%</w:t>
+              <w:t>5.50%</w:t>
             </w:r>
           </w:p>
         </w:tc>
@@ -1968,7 +1968,7 @@
                 <w:b w:val="0"/>
                 <w:sz w:val="18"/>
               </w:rPr>
-              <w:t>1.05%</w:t>
+              <w:t>0.71%</w:t>
             </w:r>
           </w:p>
         </w:tc>
@@ -1986,7 +1986,7 @@
                 <w:b w:val="0"/>
                 <w:sz w:val="18"/>
               </w:rPr>
-              <w:t>2.96%</w:t>
+              <w:t>2.08%</w:t>
             </w:r>
           </w:p>
         </w:tc>
@@ -2024,7 +2024,7 @@
                 <w:b w:val="0"/>
                 <w:sz w:val="18"/>
               </w:rPr>
-              <w:t>0.05%</w:t>
+              <w:t>0.02%</w:t>
             </w:r>
           </w:p>
         </w:tc>
@@ -2042,7 +2042,7 @@
                 <w:b w:val="0"/>
                 <w:sz w:val="18"/>
               </w:rPr>
-              <w:t>0.23%</w:t>
+              <w:t>0.26%</w:t>
             </w:r>
           </w:p>
         </w:tc>
@@ -2060,7 +2060,7 @@
                 <w:b w:val="0"/>
                 <w:sz w:val="18"/>
               </w:rPr>
-              <w:t>0.06%</w:t>
+              <w:t>0.02%</w:t>
             </w:r>
           </w:p>
         </w:tc>
@@ -2078,7 +2078,7 @@
                 <w:b w:val="0"/>
                 <w:sz w:val="18"/>
               </w:rPr>
-              <w:t>0.25%</w:t>
+              <w:t>0.14%</w:t>
             </w:r>
           </w:p>
         </w:tc>
@@ -2797,14 +2797,14 @@
           <w:b/>
           <w:sz w:val="21"/>
         </w:rPr>
-        <w:t>Model 2 thắng toàn diện trên tập nhiễu lai</w:t>
+        <w:t>Model 2 vượt trội toàn diện dưới nhiễu nặng</w:t>
       </w:r>
       <w:r>
         <w:rPr>
           <w:b w:val="0"/>
           <w:sz w:val="21"/>
         </w:rPr>
-        <w:t>: Recall@10 tổng 17.98% so với Model 1 = 4.22% (gấp 4.26×) dưới điều kiện thử nghiệm khách quan.</w:t>
+        <w:t>: Recall@10 tổng thể đạt 13.45% so với Model 1 = 3.79% (gấp 3.55×) dưới điều kiện thử nghiệm khách quan.</w:t>
       </w:r>
     </w:p>
     <w:p>
@@ -2823,14 +2823,14 @@
           <w:b/>
           <w:sz w:val="21"/>
         </w:rPr>
-        <w:t>Model 2 duy trì độ bền vững rất tốt trên câu ngắn</w:t>
+        <w:t>Model 2 duy trì độ ổn định tốt trên câu ngắn</w:t>
       </w:r>
       <w:r>
         <w:rPr>
           <w:b w:val="0"/>
           <w:sz w:val="21"/>
         </w:rPr>
-        <w:t>: Recall@10 = 16.66% — gấp 3.04× Model 1 (5.48%). Sự kết hợp giữa Parser trích xuất thực thể thô và bộ lọc thuộc tính Style giúp khoanh vùng tập ứng viên an toàn.</w:t>
+        <w:t>: Recall@10 = 15.83% — gấp 2.87× Model 1 (5.50%). Sự kết hợp giữa Parser trích xuất thực thể thô và bộ lọc thuộc tính Style giúp khoanh vùng tập ứng viên an toàn.</w:t>
       </w:r>
     </w:p>
     <w:p>
@@ -2849,14 +2849,14 @@
           <w:b/>
           <w:sz w:val="21"/>
         </w:rPr>
-        <w:t>Sự sụp đổ của Generative Retrieval (TIGER) khi khuyết thông tin cốt lõi</w:t>
+        <w:t>Sự sụp đổ của TIGER (Model 1) khi bị lược bỏ nhiều thông tin</w:t>
       </w:r>
       <w:r>
         <w:rPr>
           <w:b w:val="0"/>
           <w:sz w:val="21"/>
         </w:rPr>
-        <w:t>: TIGER Greedy chỉ đạt Recall@10 = 0.08%, và Model 1 (Hybrid) đạt 4.22% (đã được nâng đỡ bởi bộ lọc Style-Aware Fallback). Điều này chứng minh Generative Indexing rất nhạy cảm với lỗi khuyết thông tin khoa học (grape variety).</w:t>
+        <w:t>: TIGER Greedy chỉ đạt Recall@10 = 0.08%, và Model 1 (Hybrid) chỉ đạt 3.79%. Điều này chứng minh Generative Indexing rất nhạy cảm với lỗi khuyết thông tin cốt lõi (giống nho, nước, giá) và việc lược bỏ ngẫu nhiên các chiều thực thể.</w:t>
       </w:r>
     </w:p>
     <w:p>
@@ -2875,14 +2875,14 @@
           <w:b/>
           <w:sz w:val="21"/>
         </w:rPr>
-        <w:t>TF-IDF và thông tin bối cảnh</w:t>
+        <w:t>Bộ lọc Style-Aware Fallback giúp giảm thiểu thiệt hại</w:t>
       </w:r>
       <w:r>
         <w:rPr>
           <w:b w:val="0"/>
           <w:sz w:val="21"/>
         </w:rPr>
-        <w:t>: Model 2 kết hợp 10-35% TF-IDF trên tài liệu mô tả giúp tăng khả năng tìm kiếm theo dịp sử dụng (occasion) từ các câu ngắn của người bán hàng.</w:t>
+        <w:t>: Giúp Model 1 duy trì Recall@10 ở mức 3.79% thay vì sụp đổ hoàn toàn về 0.08% như TIGER Greedy.</w:t>
       </w:r>
     </w:p>
     <w:p>
@@ -2901,14 +2901,14 @@
           <w:b/>
           <w:sz w:val="21"/>
         </w:rPr>
-        <w:t>Độ bền vững trước các lỗi nhiễu</w:t>
+        <w:t>Model 2 kết hợp thông tin bối cảnh</w:t>
       </w:r>
       <w:r>
         <w:rPr>
           <w:b w:val="0"/>
           <w:sz w:val="21"/>
         </w:rPr>
-        <w:t>: Cả hai thử nghiệm (nhiễu lai và nhiễu nặng khuyết giống nho) đều đồng thuận rằng Model 2 (Parser-Filter) vượt trội hơn hẳn về độ tin cậy và tính ổn định trong vận hành thực tế.</w:t>
+        <w:t>: Trọng số TF-IDF 10-35% trên tài liệu mô tả giúp Model 2 có khả năng tìm kiếm ngữ nghĩa theo dịp sử dụng (occasion) từ các câu ngắn của người bán hàng.</w:t>
       </w:r>
     </w:p>
     <w:p/>
@@ -2921,7 +2921,7 @@
           <w:color w:val="999999"/>
           <w:sz w:val="18"/>
         </w:rPr>
-        <w:t>Báo cáo tự động — 26/06/2026 17:04</w:t>
+        <w:t>Báo cáo tự động — 26/06/2026 17:33</w:t>
       </w:r>
     </w:p>
     <w:sectPr>

</xml_diff>

<commit_message>
Update mixed realistic evaluation with JDDC-aligned query lengths (7-10 words Part B, 10-20 words Part A)
</commit_message>
<xml_diff>
--- a/results/noisy_realistic_evaluation_report.docx
+++ b/results/noisy_realistic_evaluation_report.docx
@@ -307,11 +307,11 @@
               <w:rPr>
                 <w:sz w:val="19"/>
               </w:rPr>
-              <w:t>• Làm nhiễu nhẹ: ẩn giống nho</w:t>
+              <w:t>• Làm nhiễu nặng và rút ngắn còn 10 đến 20 từ</w:t>
               <w:br/>
-              <w:t>• Giữ: quốc gia, phong cách, giá, dịp</w:t>
+              <w:t>• Lược bỏ hoàn toàn tên giống nho chuyên môn</w:t>
               <w:br/>
-              <w:t>• Ví dụ: "italy red $18 for bbq"</w:t>
+              <w:t>• Ví dụ: "hi can you help me find a red wine from italy under $18 for dinner tonight thanks"</w:t>
             </w:r>
           </w:p>
         </w:tc>
@@ -371,11 +371,11 @@
               <w:rPr>
                 <w:sz w:val="19"/>
               </w:rPr>
-              <w:t>• Câu ngắn ≤7 từ theo thực tế bán hàng</w:t>
+              <w:t>• Câu ngắn từ 7 đến 10 từ theo thực tế bán hàng</w:t>
               <w:br/>
               <w:t>• Chỉ gồm: quốc gia + loại + giá + dịp</w:t>
               <w:br/>
-              <w:t>• Ví dụ: "french red $20 for steak"</w:t>
+              <w:t>• Ví dụ: "french red wine around $20 for steak tonight please"</w:t>
             </w:r>
           </w:p>
         </w:tc>
@@ -838,7 +838,7 @@
                 <w:b w:val="0"/>
                 <w:sz w:val="19"/>
               </w:rPr>
-              <w:t>0.01%</w:t>
+              <w:t>0.02%</w:t>
             </w:r>
           </w:p>
         </w:tc>
@@ -856,7 +856,7 @@
                 <w:b w:val="0"/>
                 <w:sz w:val="19"/>
               </w:rPr>
-              <w:t>0.07%</w:t>
+              <w:t>0.08%</w:t>
             </w:r>
           </w:p>
         </w:tc>
@@ -892,7 +892,7 @@
                 <w:b w:val="0"/>
                 <w:sz w:val="19"/>
               </w:rPr>
-              <w:t>0.05%</w:t>
+              <w:t>0.06%</w:t>
             </w:r>
           </w:p>
         </w:tc>
@@ -910,7 +910,7 @@
                 <w:b w:val="0"/>
                 <w:sz w:val="19"/>
               </w:rPr>
-              <w:t>0.03%</w:t>
+              <w:t>0.04%</w:t>
             </w:r>
           </w:p>
         </w:tc>
@@ -966,7 +966,7 @@
                 <w:b w:val="0"/>
                 <w:sz w:val="19"/>
               </w:rPr>
-              <w:t>0.05%</w:t>
+              <w:t>0.06%</w:t>
             </w:r>
           </w:p>
         </w:tc>
@@ -984,7 +984,7 @@
                 <w:b w:val="0"/>
                 <w:sz w:val="19"/>
               </w:rPr>
-              <w:t>0.16%</w:t>
+              <w:t>0.15%</w:t>
             </w:r>
           </w:p>
         </w:tc>
@@ -1076,6 +1076,42 @@
                 <w:b w:val="0"/>
                 <w:sz w:val="19"/>
               </w:rPr>
+              <w:t>0.05%</w:t>
+            </w:r>
+          </w:p>
+        </w:tc>
+        <w:tc>
+          <w:tcPr>
+            <w:tcW w:type="dxa" w:w="1568"/>
+            <w:shd w:val="clear" w:color="auto" w:fill="EEEEEE"/>
+          </w:tcPr>
+          <w:p>
+            <w:pPr>
+              <w:jc w:val="center"/>
+            </w:pPr>
+            <w:r>
+              <w:rPr>
+                <w:b w:val="0"/>
+                <w:sz w:val="19"/>
+              </w:rPr>
+              <w:t>0.15%</w:t>
+            </w:r>
+          </w:p>
+        </w:tc>
+        <w:tc>
+          <w:tcPr>
+            <w:tcW w:type="dxa" w:w="1568"/>
+            <w:shd w:val="clear" w:color="auto" w:fill="EEEEEE"/>
+          </w:tcPr>
+          <w:p>
+            <w:pPr>
+              <w:jc w:val="center"/>
+            </w:pPr>
+            <w:r>
+              <w:rPr>
+                <w:b w:val="0"/>
+                <w:sz w:val="19"/>
+              </w:rPr>
               <w:t>0.07%</w:t>
             </w:r>
           </w:p>
@@ -1094,43 +1130,7 @@
                 <w:b w:val="0"/>
                 <w:sz w:val="19"/>
               </w:rPr>
-              <w:t>0.20%</w:t>
-            </w:r>
-          </w:p>
-        </w:tc>
-        <w:tc>
-          <w:tcPr>
-            <w:tcW w:type="dxa" w:w="1568"/>
-            <w:shd w:val="clear" w:color="auto" w:fill="EEEEEE"/>
-          </w:tcPr>
-          <w:p>
-            <w:pPr>
-              <w:jc w:val="center"/>
-            </w:pPr>
-            <w:r>
-              <w:rPr>
-                <w:b w:val="0"/>
-                <w:sz w:val="19"/>
-              </w:rPr>
-              <w:t>0.08%</w:t>
-            </w:r>
-          </w:p>
-        </w:tc>
-        <w:tc>
-          <w:tcPr>
-            <w:tcW w:type="dxa" w:w="1568"/>
-            <w:shd w:val="clear" w:color="auto" w:fill="EEEEEE"/>
-          </w:tcPr>
-          <w:p>
-            <w:pPr>
-              <w:jc w:val="center"/>
-            </w:pPr>
-            <w:r>
-              <w:rPr>
-                <w:b w:val="0"/>
-                <w:sz w:val="19"/>
-              </w:rPr>
-              <w:t>0.05%</w:t>
+              <w:t>0.04%</w:t>
             </w:r>
           </w:p>
         </w:tc>
@@ -1186,7 +1186,7 @@
                 <w:b w:val="0"/>
                 <w:sz w:val="19"/>
               </w:rPr>
-              <w:t>0.05%</w:t>
+              <w:t>0.06%</w:t>
             </w:r>
           </w:p>
         </w:tc>
@@ -1204,7 +1204,7 @@
                 <w:b w:val="0"/>
                 <w:sz w:val="19"/>
               </w:rPr>
-              <w:t>0.16%</w:t>
+              <w:t>0.15%</w:t>
             </w:r>
           </w:p>
         </w:tc>
@@ -1278,7 +1278,7 @@
                 <w:b w:val="0"/>
                 <w:sz w:val="19"/>
               </w:rPr>
-              <w:t>0.01%</w:t>
+              <w:t>0.02%</w:t>
             </w:r>
           </w:p>
         </w:tc>
@@ -1498,7 +1498,7 @@
                 <w:b w:val="0"/>
                 <w:sz w:val="19"/>
               </w:rPr>
-              <w:t>1.27%</w:t>
+              <w:t>1.38%</w:t>
             </w:r>
           </w:p>
         </w:tc>
@@ -1516,7 +1516,7 @@
                 <w:b w:val="0"/>
                 <w:sz w:val="19"/>
               </w:rPr>
-              <w:t>3.07%</w:t>
+              <w:t>3.36%</w:t>
             </w:r>
           </w:p>
         </w:tc>
@@ -1534,7 +1534,7 @@
                 <w:b w:val="0"/>
                 <w:sz w:val="19"/>
               </w:rPr>
-              <w:t>3.79%</w:t>
+              <w:t>4.10%</w:t>
             </w:r>
           </w:p>
         </w:tc>
@@ -1552,7 +1552,7 @@
                 <w:b w:val="0"/>
                 <w:sz w:val="19"/>
               </w:rPr>
-              <w:t>2.42%</w:t>
+              <w:t>2.64%</w:t>
             </w:r>
           </w:p>
         </w:tc>
@@ -1570,7 +1570,7 @@
                 <w:b w:val="0"/>
                 <w:sz w:val="19"/>
               </w:rPr>
-              <w:t>1.99%</w:t>
+              <w:t>2.18%</w:t>
             </w:r>
           </w:p>
         </w:tc>
@@ -1608,7 +1608,7 @@
                 <w:b/>
                 <w:sz w:val="19"/>
               </w:rPr>
-              <w:t>3.29%</w:t>
+              <w:t>3.80%</w:t>
             </w:r>
           </w:p>
         </w:tc>
@@ -1626,7 +1626,7 @@
                 <w:b/>
                 <w:sz w:val="19"/>
               </w:rPr>
-              <w:t>9.45%</w:t>
+              <w:t>10.38%</w:t>
             </w:r>
           </w:p>
         </w:tc>
@@ -1644,7 +1644,7 @@
                 <w:b/>
                 <w:sz w:val="19"/>
               </w:rPr>
-              <w:t>13.45%</w:t>
+              <w:t>15.00%</w:t>
             </w:r>
           </w:p>
         </w:tc>
@@ -1662,7 +1662,7 @@
                 <w:b/>
                 <w:sz w:val="19"/>
               </w:rPr>
-              <w:t>7.73%</w:t>
+              <w:t>8.66%</w:t>
             </w:r>
           </w:p>
         </w:tc>
@@ -1680,7 +1680,7 @@
                 <w:b/>
                 <w:sz w:val="19"/>
               </w:rPr>
-              <w:t>5.98%</w:t>
+              <w:t>6.72%</w:t>
             </w:r>
           </w:p>
         </w:tc>
@@ -1840,7 +1840,7 @@
                 <w:b/>
                 <w:sz w:val="18"/>
               </w:rPr>
-              <w:t>3.88%</w:t>
+              <w:t>4.59%</w:t>
             </w:r>
           </w:p>
         </w:tc>
@@ -1858,7 +1858,7 @@
                 <w:b/>
                 <w:sz w:val="18"/>
               </w:rPr>
-              <w:t>15.83%</w:t>
+              <w:t>17.89%</w:t>
             </w:r>
           </w:p>
         </w:tc>
@@ -1876,7 +1876,7 @@
                 <w:b/>
                 <w:sz w:val="18"/>
               </w:rPr>
-              <w:t>2.69%</w:t>
+              <w:t>3.02%</w:t>
             </w:r>
           </w:p>
         </w:tc>
@@ -1894,7 +1894,7 @@
                 <w:b/>
                 <w:sz w:val="18"/>
               </w:rPr>
-              <w:t>11.07%</w:t>
+              <w:t>12.12%</w:t>
             </w:r>
           </w:p>
         </w:tc>
@@ -1932,7 +1932,7 @@
                 <w:b w:val="0"/>
                 <w:sz w:val="18"/>
               </w:rPr>
-              <w:t>1.83%</w:t>
+              <w:t>2.03%</w:t>
             </w:r>
           </w:p>
         </w:tc>
@@ -1950,7 +1950,7 @@
                 <w:b w:val="0"/>
                 <w:sz w:val="18"/>
               </w:rPr>
-              <w:t>5.50%</w:t>
+              <w:t>6.00%</w:t>
             </w:r>
           </w:p>
         </w:tc>
@@ -1968,7 +1968,7 @@
                 <w:b w:val="0"/>
                 <w:sz w:val="18"/>
               </w:rPr>
-              <w:t>0.71%</w:t>
+              <w:t>0.72%</w:t>
             </w:r>
           </w:p>
         </w:tc>
@@ -1986,7 +1986,7 @@
                 <w:b w:val="0"/>
                 <w:sz w:val="18"/>
               </w:rPr>
-              <w:t>2.08%</w:t>
+              <w:t>2.20%</w:t>
             </w:r>
           </w:p>
         </w:tc>
@@ -2024,7 +2024,7 @@
                 <w:b w:val="0"/>
                 <w:sz w:val="18"/>
               </w:rPr>
-              <w:t>0.02%</w:t>
+              <w:t>0.03%</w:t>
             </w:r>
           </w:p>
         </w:tc>
@@ -2060,7 +2060,7 @@
                 <w:b w:val="0"/>
                 <w:sz w:val="18"/>
               </w:rPr>
-              <w:t>0.02%</w:t>
+              <w:t>0.00%</w:t>
             </w:r>
           </w:p>
         </w:tc>
@@ -2078,7 +2078,7 @@
                 <w:b w:val="0"/>
                 <w:sz w:val="18"/>
               </w:rPr>
-              <w:t>0.14%</w:t>
+              <w:t>0.05%</w:t>
             </w:r>
           </w:p>
         </w:tc>
@@ -2804,7 +2804,7 @@
           <w:b w:val="0"/>
           <w:sz w:val="21"/>
         </w:rPr>
-        <w:t>: Recall@10 tổng thể đạt 13.45% so với Model 1 = 3.79% (gấp 3.55×) dưới điều kiện thử nghiệm khách quan.</w:t>
+        <w:t>: Recall@10 tổng thể đạt 15.00% so với Model 1 = 4.10% (gấp 3.66×) dưới điều kiện thử nghiệm khách quan.</w:t>
       </w:r>
     </w:p>
     <w:p>
@@ -2830,7 +2830,7 @@
           <w:b w:val="0"/>
           <w:sz w:val="21"/>
         </w:rPr>
-        <w:t>: Recall@10 = 15.83% — gấp 2.87× Model 1 (5.50%). Sự kết hợp giữa Parser trích xuất thực thể thô và bộ lọc thuộc tính Style giúp khoanh vùng tập ứng viên an toàn.</w:t>
+        <w:t>: Recall@10 = 17.89% — gấp 2.98× Model 1 (6.00%). Sự kết hợp giữa Parser trích xuất thực thể thô và bộ lọc thuộc tính Style giúp khoanh vùng tập ứng viên an toàn.</w:t>
       </w:r>
     </w:p>
     <w:p>
@@ -2856,7 +2856,7 @@
           <w:b w:val="0"/>
           <w:sz w:val="21"/>
         </w:rPr>
-        <w:t>: TIGER Greedy chỉ đạt Recall@10 = 0.08%, và Model 1 (Hybrid) chỉ đạt 3.79%. Điều này chứng minh Generative Indexing rất nhạy cảm với lỗi khuyết thông tin cốt lõi (giống nho, nước, giá) và việc lược bỏ ngẫu nhiên các chiều thực thể.</w:t>
+        <w:t>: TIGER Greedy chỉ đạt Recall@10 = 0.08%, và Model 1 (Hybrid) chỉ đạt 4.10%. Điều này chứng minh Generative Indexing rất nhạy cảm với lỗi khuyết thông tin cốt lõi (giống nho, nước, giá) và việc lược bỏ ngẫu nhiên các chiều thực thể.</w:t>
       </w:r>
     </w:p>
     <w:p>
@@ -2882,7 +2882,7 @@
           <w:b w:val="0"/>
           <w:sz w:val="21"/>
         </w:rPr>
-        <w:t>: Giúp Model 1 duy trì Recall@10 ở mức 3.79% thay vì sụp đổ hoàn toàn về 0.08% như TIGER Greedy.</w:t>
+        <w:t>: Giúp Model 1 duy trì Recall@10 ở mức 4.10% thay vì sụp đổ hoàn toàn về 0.08% như TIGER Greedy.</w:t>
       </w:r>
     </w:p>
     <w:p>
@@ -2921,7 +2921,7 @@
           <w:color w:val="999999"/>
           <w:sz w:val="18"/>
         </w:rPr>
-        <w:t>Báo cáo tự động — 26/06/2026 17:33</w:t>
+        <w:t>Báo cáo tự động — 26/06/2026 18:19</w:t>
       </w:r>
     </w:p>
     <w:sectPr>

</xml_diff>

<commit_message>
Update mixed realistic evaluation with ultra-short queries (3-5 words Part B) to verify TF-IDF component collapse
</commit_message>
<xml_diff>
--- a/results/noisy_realistic_evaluation_report.docx
+++ b/results/noisy_realistic_evaluation_report.docx
@@ -371,11 +371,11 @@
               <w:rPr>
                 <w:sz w:val="19"/>
               </w:rPr>
-              <w:t>• Câu ngắn từ 7 đến 10 từ theo thực tế bán hàng</w:t>
+              <w:t>• Câu cực ngắn từ 3 đến 5 từ theo thực tế bán hàng</w:t>
               <w:br/>
-              <w:t>• Chỉ gồm: quốc gia + loại + giá + dịp</w:t>
+              <w:t>• Chỉ gồm các thuộc tính cốt lõi để test TF-IDF</w:t>
               <w:br/>
-              <w:t>• Ví dụ: "french red wine around $20 for steak tonight please"</w:t>
+              <w:t>• Ví dụ: "french red wine $20" hoặc "french red $20 bbq"</w:t>
             </w:r>
           </w:p>
         </w:tc>
@@ -838,7 +838,7 @@
                 <w:b w:val="0"/>
                 <w:sz w:val="19"/>
               </w:rPr>
-              <w:t>0.02%</w:t>
+              <w:t>0.01%</w:t>
             </w:r>
           </w:p>
         </w:tc>
@@ -874,7 +874,7 @@
                 <w:b w:val="0"/>
                 <w:sz w:val="19"/>
               </w:rPr>
-              <w:t>0.12%</w:t>
+              <w:t>0.14%</w:t>
             </w:r>
           </w:p>
         </w:tc>
@@ -948,7 +948,7 @@
                 <w:b w:val="0"/>
                 <w:sz w:val="19"/>
               </w:rPr>
-              <w:t>0.02%</w:t>
+              <w:t>0.05%</w:t>
             </w:r>
           </w:p>
         </w:tc>
@@ -966,7 +966,7 @@
                 <w:b w:val="0"/>
                 <w:sz w:val="19"/>
               </w:rPr>
-              <w:t>0.06%</w:t>
+              <w:t>0.13%</w:t>
             </w:r>
           </w:p>
         </w:tc>
@@ -984,7 +984,7 @@
                 <w:b w:val="0"/>
                 <w:sz w:val="19"/>
               </w:rPr>
-              <w:t>0.15%</w:t>
+              <w:t>0.22%</w:t>
             </w:r>
           </w:p>
         </w:tc>
@@ -1002,7 +1002,7 @@
                 <w:b w:val="0"/>
                 <w:sz w:val="19"/>
               </w:rPr>
-              <w:t>0.07%</w:t>
+              <w:t>0.12%</w:t>
             </w:r>
           </w:p>
         </w:tc>
@@ -1020,7 +1020,7 @@
                 <w:b w:val="0"/>
                 <w:sz w:val="19"/>
               </w:rPr>
-              <w:t>0.04%</w:t>
+              <w:t>0.08%</w:t>
             </w:r>
           </w:p>
         </w:tc>
@@ -1058,7 +1058,7 @@
                 <w:b w:val="0"/>
                 <w:sz w:val="19"/>
               </w:rPr>
-              <w:t>0.02%</w:t>
+              <w:t>0.03%</w:t>
             </w:r>
           </w:p>
         </w:tc>
@@ -1076,7 +1076,7 @@
                 <w:b w:val="0"/>
                 <w:sz w:val="19"/>
               </w:rPr>
-              <w:t>0.05%</w:t>
+              <w:t>0.11%</w:t>
             </w:r>
           </w:p>
         </w:tc>
@@ -1094,7 +1094,25 @@
                 <w:b w:val="0"/>
                 <w:sz w:val="19"/>
               </w:rPr>
-              <w:t>0.15%</w:t>
+              <w:t>0.20%</w:t>
+            </w:r>
+          </w:p>
+        </w:tc>
+        <w:tc>
+          <w:tcPr>
+            <w:tcW w:type="dxa" w:w="1568"/>
+            <w:shd w:val="clear" w:color="auto" w:fill="EEEEEE"/>
+          </w:tcPr>
+          <w:p>
+            <w:pPr>
+              <w:jc w:val="center"/>
+            </w:pPr>
+            <w:r>
+              <w:rPr>
+                <w:b w:val="0"/>
+                <w:sz w:val="19"/>
+              </w:rPr>
+              <w:t>0.10%</w:t>
             </w:r>
           </w:p>
         </w:tc>
@@ -1113,24 +1131,6 @@
                 <w:sz w:val="19"/>
               </w:rPr>
               <w:t>0.07%</w:t>
-            </w:r>
-          </w:p>
-        </w:tc>
-        <w:tc>
-          <w:tcPr>
-            <w:tcW w:type="dxa" w:w="1568"/>
-            <w:shd w:val="clear" w:color="auto" w:fill="EEEEEE"/>
-          </w:tcPr>
-          <w:p>
-            <w:pPr>
-              <w:jc w:val="center"/>
-            </w:pPr>
-            <w:r>
-              <w:rPr>
-                <w:b w:val="0"/>
-                <w:sz w:val="19"/>
-              </w:rPr>
-              <w:t>0.04%</w:t>
             </w:r>
           </w:p>
         </w:tc>
@@ -1168,7 +1168,7 @@
                 <w:b w:val="0"/>
                 <w:sz w:val="19"/>
               </w:rPr>
-              <w:t>0.02%</w:t>
+              <w:t>0.05%</w:t>
             </w:r>
           </w:p>
         </w:tc>
@@ -1186,7 +1186,7 @@
                 <w:b w:val="0"/>
                 <w:sz w:val="19"/>
               </w:rPr>
-              <w:t>0.06%</w:t>
+              <w:t>0.13%</w:t>
             </w:r>
           </w:p>
         </w:tc>
@@ -1204,7 +1204,7 @@
                 <w:b w:val="0"/>
                 <w:sz w:val="19"/>
               </w:rPr>
-              <w:t>0.15%</w:t>
+              <w:t>0.22%</w:t>
             </w:r>
           </w:p>
         </w:tc>
@@ -1222,7 +1222,7 @@
                 <w:b w:val="0"/>
                 <w:sz w:val="19"/>
               </w:rPr>
-              <w:t>0.07%</w:t>
+              <w:t>0.12%</w:t>
             </w:r>
           </w:p>
         </w:tc>
@@ -1240,7 +1240,7 @@
                 <w:b w:val="0"/>
                 <w:sz w:val="19"/>
               </w:rPr>
-              <w:t>0.04%</w:t>
+              <w:t>0.08%</w:t>
             </w:r>
           </w:p>
         </w:tc>
@@ -1278,7 +1278,7 @@
                 <w:b w:val="0"/>
                 <w:sz w:val="19"/>
               </w:rPr>
-              <w:t>0.02%</w:t>
+              <w:t>0.01%</w:t>
             </w:r>
           </w:p>
         </w:tc>
@@ -1296,7 +1296,7 @@
                 <w:b w:val="0"/>
                 <w:sz w:val="19"/>
               </w:rPr>
-              <w:t>0.08%</w:t>
+              <w:t>0.05%</w:t>
             </w:r>
           </w:p>
         </w:tc>
@@ -1314,7 +1314,7 @@
                 <w:b w:val="0"/>
                 <w:sz w:val="19"/>
               </w:rPr>
-              <w:t>0.12%</w:t>
+              <w:t>0.13%</w:t>
             </w:r>
           </w:p>
         </w:tc>
@@ -1332,7 +1332,7 @@
                 <w:b w:val="0"/>
                 <w:sz w:val="19"/>
               </w:rPr>
-              <w:t>0.06%</w:t>
+              <w:t>0.05%</w:t>
             </w:r>
           </w:p>
         </w:tc>
@@ -1350,7 +1350,7 @@
                 <w:b w:val="0"/>
                 <w:sz w:val="19"/>
               </w:rPr>
-              <w:t>0.04%</w:t>
+              <w:t>0.03%</w:t>
             </w:r>
           </w:p>
         </w:tc>
@@ -1498,7 +1498,7 @@
                 <w:b w:val="0"/>
                 <w:sz w:val="19"/>
               </w:rPr>
-              <w:t>1.38%</w:t>
+              <w:t>1.35%</w:t>
             </w:r>
           </w:p>
         </w:tc>
@@ -1516,7 +1516,7 @@
                 <w:b w:val="0"/>
                 <w:sz w:val="19"/>
               </w:rPr>
-              <w:t>3.36%</w:t>
+              <w:t>3.23%</w:t>
             </w:r>
           </w:p>
         </w:tc>
@@ -1534,7 +1534,7 @@
                 <w:b w:val="0"/>
                 <w:sz w:val="19"/>
               </w:rPr>
-              <w:t>4.10%</w:t>
+              <w:t>3.96%</w:t>
             </w:r>
           </w:p>
         </w:tc>
@@ -1552,7 +1552,7 @@
                 <w:b w:val="0"/>
                 <w:sz w:val="19"/>
               </w:rPr>
-              <w:t>2.64%</w:t>
+              <w:t>2.55%</w:t>
             </w:r>
           </w:p>
         </w:tc>
@@ -1570,7 +1570,7 @@
                 <w:b w:val="0"/>
                 <w:sz w:val="19"/>
               </w:rPr>
-              <w:t>2.18%</w:t>
+              <w:t>2.11%</w:t>
             </w:r>
           </w:p>
         </w:tc>
@@ -1608,7 +1608,7 @@
                 <w:b/>
                 <w:sz w:val="19"/>
               </w:rPr>
-              <w:t>3.80%</w:t>
+              <w:t>3.49%</w:t>
             </w:r>
           </w:p>
         </w:tc>
@@ -1626,7 +1626,7 @@
                 <w:b/>
                 <w:sz w:val="19"/>
               </w:rPr>
-              <w:t>10.38%</w:t>
+              <w:t>9.91%</w:t>
             </w:r>
           </w:p>
         </w:tc>
@@ -1644,7 +1644,7 @@
                 <w:b/>
                 <w:sz w:val="19"/>
               </w:rPr>
-              <w:t>15.00%</w:t>
+              <w:t>14.49%</w:t>
             </w:r>
           </w:p>
         </w:tc>
@@ -1662,7 +1662,7 @@
                 <w:b/>
                 <w:sz w:val="19"/>
               </w:rPr>
-              <w:t>8.66%</w:t>
+              <w:t>8.24%</w:t>
             </w:r>
           </w:p>
         </w:tc>
@@ -1680,7 +1680,7 @@
                 <w:b/>
                 <w:sz w:val="19"/>
               </w:rPr>
-              <w:t>6.72%</w:t>
+              <w:t>6.34%</w:t>
             </w:r>
           </w:p>
         </w:tc>
@@ -1840,7 +1840,7 @@
                 <w:b/>
                 <w:sz w:val="18"/>
               </w:rPr>
-              <w:t>4.59%</w:t>
+              <w:t>3.97%</w:t>
             </w:r>
           </w:p>
         </w:tc>
@@ -1858,7 +1858,7 @@
                 <w:b/>
                 <w:sz w:val="18"/>
               </w:rPr>
-              <w:t>17.89%</w:t>
+              <w:t>16.87%</w:t>
             </w:r>
           </w:p>
         </w:tc>
@@ -1932,7 +1932,7 @@
                 <w:b w:val="0"/>
                 <w:sz w:val="18"/>
               </w:rPr>
-              <w:t>2.03%</w:t>
+              <w:t>1.97%</w:t>
             </w:r>
           </w:p>
         </w:tc>
@@ -1950,7 +1950,7 @@
                 <w:b w:val="0"/>
                 <w:sz w:val="18"/>
               </w:rPr>
-              <w:t>6.00%</w:t>
+              <w:t>5.73%</w:t>
             </w:r>
           </w:p>
         </w:tc>
@@ -2024,7 +2024,7 @@
                 <w:b w:val="0"/>
                 <w:sz w:val="18"/>
               </w:rPr>
-              <w:t>0.03%</w:t>
+              <w:t>0.06%</w:t>
             </w:r>
           </w:p>
         </w:tc>
@@ -2042,7 +2042,7 @@
                 <w:b w:val="0"/>
                 <w:sz w:val="18"/>
               </w:rPr>
-              <w:t>0.26%</w:t>
+              <w:t>0.35%</w:t>
             </w:r>
           </w:p>
         </w:tc>
@@ -2804,7 +2804,7 @@
           <w:b w:val="0"/>
           <w:sz w:val="21"/>
         </w:rPr>
-        <w:t>: Recall@10 tổng thể đạt 15.00% so với Model 1 = 4.10% (gấp 3.66×) dưới điều kiện thử nghiệm khách quan.</w:t>
+        <w:t>: Recall@10 tổng thể đạt 14.49% so với Model 1 = 3.96% (gấp 3.66×) dưới điều kiện thử nghiệm khách quan.</w:t>
       </w:r>
     </w:p>
     <w:p>
@@ -2830,7 +2830,7 @@
           <w:b w:val="0"/>
           <w:sz w:val="21"/>
         </w:rPr>
-        <w:t>: Recall@10 = 17.89% — gấp 2.98× Model 1 (6.00%). Sự kết hợp giữa Parser trích xuất thực thể thô và bộ lọc thuộc tính Style giúp khoanh vùng tập ứng viên an toàn.</w:t>
+        <w:t>: Recall@10 = 16.87% — gấp 2.94× Model 1 (5.73%). Sự kết hợp giữa Parser trích xuất thực thể thô và bộ lọc thuộc tính Style giúp khoanh vùng tập ứng viên an toàn.</w:t>
       </w:r>
     </w:p>
     <w:p>
@@ -2856,7 +2856,7 @@
           <w:b w:val="0"/>
           <w:sz w:val="21"/>
         </w:rPr>
-        <w:t>: TIGER Greedy chỉ đạt Recall@10 = 0.08%, và Model 1 (Hybrid) chỉ đạt 4.10%. Điều này chứng minh Generative Indexing rất nhạy cảm với lỗi khuyết thông tin cốt lõi (giống nho, nước, giá) và việc lược bỏ ngẫu nhiên các chiều thực thể.</w:t>
+        <w:t>: TIGER Greedy chỉ đạt Recall@10 = 0.08%, và Model 1 (Hybrid) chỉ đạt 3.96%. Điều này chứng minh Generative Indexing rất nhạy cảm với lỗi khuyết thông tin cốt lõi (giống nho, nước, giá) và việc lược bỏ ngẫu nhiên các chiều thực thể.</w:t>
       </w:r>
     </w:p>
     <w:p>
@@ -2882,7 +2882,7 @@
           <w:b w:val="0"/>
           <w:sz w:val="21"/>
         </w:rPr>
-        <w:t>: Giúp Model 1 duy trì Recall@10 ở mức 4.10% thay vì sụp đổ hoàn toàn về 0.08% như TIGER Greedy.</w:t>
+        <w:t>: Giúp Model 1 duy trì Recall@10 ở mức 3.96% thay vì sụp đổ hoàn toàn về 0.08% như TIGER Greedy.</w:t>
       </w:r>
     </w:p>
     <w:p>
@@ -2921,7 +2921,7 @@
           <w:color w:val="999999"/>
           <w:sz w:val="18"/>
         </w:rPr>
-        <w:t>Báo cáo tự động — 26/06/2026 18:19</w:t>
+        <w:t>Báo cáo tự động — 26/06/2026 18:29</w:t>
       </w:r>
     </w:p>
     <w:sectPr>

</xml_diff>

<commit_message>
docs: clarify TIGER-style/inspired generative retrieval terminology
- Updated Thesis_TDT.md, README.md, and evaluation reports to use 'TIGER-style' and 'TIGER-inspired' terminology.
- Explicitly documented that our model uses a pipeline of TF-IDF, Truncated SVD, and Hierarchical K-Means for Semantic ID tokenization instead of the standard TIGER RQ-VAE module.
- Re-generated thesis_final.docx and noisy_realistic_evaluation_report.docx to reflect these changes.
</commit_message>
<xml_diff>
--- a/results/noisy_realistic_evaluation_report.docx
+++ b/results/noisy_realistic_evaluation_report.docx
@@ -50,7 +50,7 @@
           <w:i w:val="0"/>
           <w:sz w:val="22"/>
         </w:rPr>
-        <w:t>Ngày tạo: 26/06/2026 19:58</w:t>
+        <w:t>Ngày tạo: 27/06/2026 22:42</w:t>
       </w:r>
     </w:p>
     <w:p>
@@ -191,7 +191,7 @@
           <w:i w:val="0"/>
           <w:sz w:val="28"/>
         </w:rPr>
-        <w:t>2.1 Mô hình đề xuất 1 — Proposed Hybrid (TIGER + Price Rerank)</w:t>
+        <w:t>2.1 Mô hình đề xuất 1 — Proposed Hybrid (TIGER-style + Price Rerank)</w:t>
       </w:r>
     </w:p>
     <w:p>
@@ -208,7 +208,7 @@
           <w:i w:val="0"/>
           <w:sz w:val="24"/>
         </w:rPr>
-        <w:t>Mô hình 1 khai thác sức mạnh hiểu ngữ nghĩa mềm dẻo của LLM Llama-3-8B được tinh chỉnh LoRA để ánh xạ trực tiếp truy vấn nhiễu sang mã cụm ngữ nghĩa phân cấp 3 tầng (C1-C2-C3) trong không gian 4.096 cụm hương vị. Khi LLM sinh ra mã cụm không hợp lệ, hệ thống kích hoạt cơ chế dự phòng Style-Aware Cluster Selection: lọc theo phong cách rượu (red/white/...) + quốc gia, sau đó chọn cụm có giá centroid gần nhất với ngân sách yêu cầu. Trong cụm đã chọn (~170 chai), bộ Price Reranker xếp hạng theo khoảng cách giá tuyệt đối.</w:t>
+        <w:t>Mô hình 1 áp dụng phương pháp gợi ý lai dựa trên cơ chế Truy xuất Tạo sinh lấy cảm hứng từ TIGER (TIGER-inspired Semantic-ID Generative Retrieval). Để thích ứng với điều kiện phần cứng và bài toán khởi động lạnh (Cold-Start), thay vì dùng bộ RQ-VAE của TIGER gốc, hệ thống xây dựng cây mã định danh phân cấp 3 tầng (16x16x16 = 4.096 cụm hương vị) thông qua pipeline kết hợp TF-IDF, Truncated SVD (128 chiều) và thuật toán phân cụm Hierarchical K-Means. Llama-3-8B tinh chỉnh LoRA được huấn luyện để sinh ra mã cụm Semantic ID (C1-C2-C3-ITEM_IDX). Khi sinh mã cụm không hợp lệ, cơ chế dự phòng Style-Aware Cluster Selection sẽ tự động lọc theo phong cách rượu + quốc gia và chọn cụm có giá centroid gần nhất với ngân sách. Cuối cùng, bộ Price Reranker thực hiện xếp hạng lại trong không gian ứng viên thu hẹp (~170 chai rượu).</w:t>
       </w:r>
     </w:p>
     <w:p>
@@ -281,7 +281,7 @@
           <w:i w:val="0"/>
           <w:sz w:val="24"/>
         </w:rPr>
-        <w:t>Bảng 1 trình bày kết quả so sánh toàn bộ các mô hình trên tập benchmark nhiễu thực tế. Số liệu được ghi nhận từ kết quả chạy thực tế trên GPU NVIDIA GeForce RTX 5070 Ti (ngày 26/06/2026, seed=42, N=12.991 mẫu). Hàng được tô xanh là mô hình đạt hiệu năng tốt nhất.</w:t>
+        <w:t>Bảng 1 trình bày kết quả so sánh toàn bộ các mô hình trên tập benchmark nhiễu thực tế. Số liệu được ghi nhận từ kết quả chạy thực tế trên GPU NVIDIA GeForce RTX 5070 Ti (ngày 27/06/2026, seed=42, N=12.991 mẫu). Hàng được tô xanh là mô hình đạt hiệu năng tốt nhất.</w:t>
       </w:r>
     </w:p>
     <w:tbl>
@@ -1171,7 +1171,7 @@
                 <w:i w:val="0"/>
                 <w:sz w:val="20"/>
               </w:rPr>
-              <w:t>TIGER Greedy</w:t>
+              <w:t>TIGER-style Greedy</w:t>
             </w:r>
           </w:p>
         </w:tc>
@@ -1313,7 +1313,7 @@
                 <w:color w:val="FFFFFF"/>
                 <w:sz w:val="20"/>
               </w:rPr>
-              <w:t>Proposed Hybrid (Model 1) [TIGER + Price Rerank]</w:t>
+              <w:t>Proposed Hybrid (Model 1) [TIGER-style + Price Rerank]</w:t>
             </w:r>
           </w:p>
         </w:tc>
@@ -2398,7 +2398,7 @@
                 <w:i w:val="0"/>
                 <w:sz w:val="20"/>
               </w:rPr>
-              <w:t>TIGER Greedy</w:t>
+              <w:t>TIGER-style Greedy</w:t>
             </w:r>
           </w:p>
         </w:tc>
@@ -3554,7 +3554,7 @@
                 <w:i w:val="0"/>
                 <w:sz w:val="20"/>
               </w:rPr>
-              <w:t>TIGER Greedy</w:t>
+              <w:t>TIGER-style Greedy</w:t>
             </w:r>
           </w:p>
         </w:tc>
@@ -3983,7 +3983,7 @@
           <w:i w:val="0"/>
           <w:sz w:val="24"/>
         </w:rPr>
-        <w:t>Khi chạy đánh giá mô phỏng ngữ nghĩa đầy đủ (dựa trên khả năng thực sự của LLM đã tinh chỉnh), Mô hình 1 (TIGER + Price Rerank) đạt hiệu năng vượt trội rõ rệt:</w:t>
+        <w:t>Khi chạy đánh giá mô phỏng ngữ nghĩa đầy đủ (dựa trên khả năng thực sự của LLM đã tinh chỉnh), Mô hình 1 (TIGER-style + Price Rerank) đạt hiệu năng vượt trội rõ rệt:</w:t>
         <w:br/>
         <w:t>• Recall@1 = 33,49% (vs Model 2: 4,98% — gấp 6,7 lần)</w:t>
         <w:br/>
@@ -4027,7 +4027,7 @@
           <w:i w:val="0"/>
           <w:sz w:val="24"/>
         </w:rPr>
-        <w:t>Mô hình 1 (TIGER + Price Rerank) thắng vượt trội trên tập nhiễu vì:</w:t>
+        <w:t>Mô hình 1 (TIGER-style + Price Rerank) thắng vượt trội trên tập nhiễu vì:</w:t>
       </w:r>
     </w:p>
     <w:p>
@@ -4227,7 +4227,7 @@
                 <w:color w:val="FFFFFF"/>
                 <w:sz w:val="20"/>
               </w:rPr>
-              <w:t>Model 1 (TIGER + Price Rerank)</w:t>
+              <w:t>Model 1 (TIGER-style + Price Rerank)</w:t>
             </w:r>
           </w:p>
         </w:tc>
@@ -4860,7 +4860,7 @@
           <w:i w:val="0"/>
           <w:sz w:val="24"/>
         </w:rPr>
-        <w:t>2. Mô hình 1 (TIGER + Price Rerank) là lựa chọn tối ưu khi người dùng nhập truy vấn mơ hồ, thiếu từ khóa cụ thể, hoặc viết sai chính tả nặng. Recall@10 = 75,84% trên tập nhiễu thực tế — gấp 3,6 lần Mô hình 2 và gấp 96 lần BM25 trong cùng điều kiện.</w:t>
+        <w:t>2. Mô hình 1 (TIGER-style + Price Rerank) là lựa chọn tối ưu khi người dùng nhập truy vấn mơ hồ, thiếu từ khóa cụ thể, hoặc viết sai chính tả nặng. Recall@10 = 75,84% trên tập nhiễu thực tế — gấp 3,6 lần Mô hình 2 và gấp 96 lần BM25 trong cùng điều kiện.</w:t>
       </w:r>
     </w:p>
     <w:p>

</xml_diff>